<commit_message>
Ready for first review
</commit_message>
<xml_diff>
--- a/Vision_Series_Test_Plan.docx
+++ b/Vision_Series_Test_Plan.docx
@@ -554,6 +554,1317 @@
         </w:sectPr>
       </w:pPr>
     </w:p>
+    <w:p/>
+    <w:p/>
+    <w:p/>
+    <w:bookmarkStart w:id="1" w:name="_Toc83725214" w:displacedByCustomXml="next"/>
+    <w:bookmarkStart w:id="2" w:name="_Ref279674521" w:displacedByCustomXml="next"/>
+    <w:bookmarkStart w:id="3" w:name="_Ref276815925" w:displacedByCustomXml="next"/>
+    <w:bookmarkStart w:id="4" w:name="_Toc275005028" w:displacedByCustomXml="next"/>
+    <w:sdt>
+      <w:sdtPr>
+        <w:rPr>
+          <w:rFonts w:ascii="Calibri" w:hAnsi="Calibri"/>
+          <w:b w:val="0"/>
+          <w:bCs/>
+          <w:color w:val="auto"/>
+          <w:sz w:val="22"/>
+        </w:rPr>
+        <w:id w:val="1917594335"/>
+        <w:docPartObj>
+          <w:docPartGallery w:val="Table of Contents"/>
+          <w:docPartUnique/>
+        </w:docPartObj>
+      </w:sdtPr>
+      <w:sdtEndPr>
+        <w:rPr>
+          <w:rFonts w:asciiTheme="minorHAnsi" w:hAnsiTheme="minorHAnsi"/>
+          <w:bCs w:val="0"/>
+          <w:noProof/>
+        </w:rPr>
+      </w:sdtEndPr>
+      <w:sdtContent>
+        <w:p>
+          <w:pPr>
+            <w:pStyle w:val="Heading1-nonumber"/>
+          </w:pPr>
+          <w:r>
+            <w:t>Table of Contents</w:t>
+          </w:r>
+          <w:bookmarkEnd w:id="1"/>
+        </w:p>
+        <w:p>
+          <w:pPr>
+            <w:pStyle w:val="TOC1"/>
+            <w:tabs>
+              <w:tab w:val="right" w:leader="dot" w:pos="9629"/>
+            </w:tabs>
+            <w:rPr>
+              <w:rFonts w:eastAsiaTheme="minorEastAsia" w:cstheme="minorBidi"/>
+              <w:noProof/>
+              <w:szCs w:val="22"/>
+              <w:lang w:val="nl-BE" w:eastAsia="nl-BE"/>
+            </w:rPr>
+          </w:pPr>
+          <w:r>
+            <w:fldChar w:fldCharType="begin"/>
+          </w:r>
+          <w:r>
+            <w:instrText xml:space="preserve"> TOC \o "1-3" \h \z \u </w:instrText>
+          </w:r>
+          <w:r>
+            <w:fldChar w:fldCharType="separate"/>
+          </w:r>
+          <w:hyperlink w:anchor="_Toc83725213" w:history="1">
+            <w:r>
+              <w:rPr>
+                <w:rStyle w:val="Hyperlink"/>
+                <w:noProof/>
+              </w:rPr>
+              <w:t>Revision history</w:t>
+            </w:r>
+            <w:r>
+              <w:rPr>
+                <w:noProof/>
+                <w:webHidden/>
+              </w:rPr>
+              <w:tab/>
+            </w:r>
+            <w:r>
+              <w:rPr>
+                <w:noProof/>
+                <w:webHidden/>
+              </w:rPr>
+              <w:fldChar w:fldCharType="begin"/>
+            </w:r>
+            <w:r>
+              <w:rPr>
+                <w:noProof/>
+                <w:webHidden/>
+              </w:rPr>
+              <w:instrText xml:space="preserve"> PAGEREF _Toc83725213 \h </w:instrText>
+            </w:r>
+            <w:r>
+              <w:rPr>
+                <w:noProof/>
+                <w:webHidden/>
+              </w:rPr>
+            </w:r>
+            <w:r>
+              <w:rPr>
+                <w:noProof/>
+                <w:webHidden/>
+              </w:rPr>
+              <w:fldChar w:fldCharType="separate"/>
+            </w:r>
+            <w:r>
+              <w:rPr>
+                <w:noProof/>
+                <w:webHidden/>
+              </w:rPr>
+              <w:t>2</w:t>
+            </w:r>
+            <w:r>
+              <w:rPr>
+                <w:noProof/>
+                <w:webHidden/>
+              </w:rPr>
+              <w:fldChar w:fldCharType="end"/>
+            </w:r>
+          </w:hyperlink>
+        </w:p>
+        <w:p>
+          <w:pPr>
+            <w:pStyle w:val="TOC1"/>
+            <w:tabs>
+              <w:tab w:val="right" w:leader="dot" w:pos="9629"/>
+            </w:tabs>
+            <w:rPr>
+              <w:rFonts w:eastAsiaTheme="minorEastAsia" w:cstheme="minorBidi"/>
+              <w:noProof/>
+              <w:szCs w:val="22"/>
+              <w:lang w:val="nl-BE" w:eastAsia="nl-BE"/>
+            </w:rPr>
+          </w:pPr>
+          <w:hyperlink w:anchor="_Toc83725214" w:history="1">
+            <w:r>
+              <w:rPr>
+                <w:rStyle w:val="Hyperlink"/>
+                <w:noProof/>
+              </w:rPr>
+              <w:t>Table of Contents</w:t>
+            </w:r>
+            <w:r>
+              <w:rPr>
+                <w:noProof/>
+                <w:webHidden/>
+              </w:rPr>
+              <w:tab/>
+            </w:r>
+            <w:r>
+              <w:rPr>
+                <w:noProof/>
+                <w:webHidden/>
+              </w:rPr>
+              <w:fldChar w:fldCharType="begin"/>
+            </w:r>
+            <w:r>
+              <w:rPr>
+                <w:noProof/>
+                <w:webHidden/>
+              </w:rPr>
+              <w:instrText xml:space="preserve"> PAGEREF _Toc83725214 \h </w:instrText>
+            </w:r>
+            <w:r>
+              <w:rPr>
+                <w:noProof/>
+                <w:webHidden/>
+              </w:rPr>
+            </w:r>
+            <w:r>
+              <w:rPr>
+                <w:noProof/>
+                <w:webHidden/>
+              </w:rPr>
+              <w:fldChar w:fldCharType="separate"/>
+            </w:r>
+            <w:r>
+              <w:rPr>
+                <w:noProof/>
+                <w:webHidden/>
+              </w:rPr>
+              <w:t>3</w:t>
+            </w:r>
+            <w:r>
+              <w:rPr>
+                <w:noProof/>
+                <w:webHidden/>
+              </w:rPr>
+              <w:fldChar w:fldCharType="end"/>
+            </w:r>
+          </w:hyperlink>
+        </w:p>
+        <w:p>
+          <w:pPr>
+            <w:pStyle w:val="TOC1"/>
+            <w:tabs>
+              <w:tab w:val="right" w:leader="dot" w:pos="9629"/>
+            </w:tabs>
+            <w:rPr>
+              <w:rFonts w:eastAsiaTheme="minorEastAsia" w:cstheme="minorBidi"/>
+              <w:noProof/>
+              <w:szCs w:val="22"/>
+              <w:lang w:val="nl-BE" w:eastAsia="nl-BE"/>
+            </w:rPr>
+          </w:pPr>
+          <w:hyperlink w:anchor="_Toc83725215" w:history="1">
+            <w:r>
+              <w:rPr>
+                <w:rStyle w:val="Hyperlink"/>
+                <w:noProof/>
+              </w:rPr>
+              <w:t>List of Figures</w:t>
+            </w:r>
+            <w:r>
+              <w:rPr>
+                <w:noProof/>
+                <w:webHidden/>
+              </w:rPr>
+              <w:tab/>
+            </w:r>
+            <w:r>
+              <w:rPr>
+                <w:noProof/>
+                <w:webHidden/>
+              </w:rPr>
+              <w:fldChar w:fldCharType="begin"/>
+            </w:r>
+            <w:r>
+              <w:rPr>
+                <w:noProof/>
+                <w:webHidden/>
+              </w:rPr>
+              <w:instrText xml:space="preserve"> PAGEREF _Toc83725215 \h </w:instrText>
+            </w:r>
+            <w:r>
+              <w:rPr>
+                <w:noProof/>
+                <w:webHidden/>
+              </w:rPr>
+            </w:r>
+            <w:r>
+              <w:rPr>
+                <w:noProof/>
+                <w:webHidden/>
+              </w:rPr>
+              <w:fldChar w:fldCharType="separate"/>
+            </w:r>
+            <w:r>
+              <w:rPr>
+                <w:noProof/>
+                <w:webHidden/>
+              </w:rPr>
+              <w:t>4</w:t>
+            </w:r>
+            <w:r>
+              <w:rPr>
+                <w:noProof/>
+                <w:webHidden/>
+              </w:rPr>
+              <w:fldChar w:fldCharType="end"/>
+            </w:r>
+          </w:hyperlink>
+        </w:p>
+        <w:p>
+          <w:pPr>
+            <w:pStyle w:val="TOC1"/>
+            <w:tabs>
+              <w:tab w:val="right" w:leader="dot" w:pos="9629"/>
+            </w:tabs>
+            <w:rPr>
+              <w:rFonts w:eastAsiaTheme="minorEastAsia" w:cstheme="minorBidi"/>
+              <w:noProof/>
+              <w:szCs w:val="22"/>
+              <w:lang w:val="nl-BE" w:eastAsia="nl-BE"/>
+            </w:rPr>
+          </w:pPr>
+          <w:hyperlink w:anchor="_Toc83725216" w:history="1">
+            <w:r>
+              <w:rPr>
+                <w:rStyle w:val="Hyperlink"/>
+                <w:noProof/>
+              </w:rPr>
+              <w:t>List of Tables</w:t>
+            </w:r>
+            <w:r>
+              <w:rPr>
+                <w:noProof/>
+                <w:webHidden/>
+              </w:rPr>
+              <w:tab/>
+            </w:r>
+            <w:r>
+              <w:rPr>
+                <w:noProof/>
+                <w:webHidden/>
+              </w:rPr>
+              <w:fldChar w:fldCharType="begin"/>
+            </w:r>
+            <w:r>
+              <w:rPr>
+                <w:noProof/>
+                <w:webHidden/>
+              </w:rPr>
+              <w:instrText xml:space="preserve"> PAGEREF _Toc83725216 \h </w:instrText>
+            </w:r>
+            <w:r>
+              <w:rPr>
+                <w:noProof/>
+                <w:webHidden/>
+              </w:rPr>
+            </w:r>
+            <w:r>
+              <w:rPr>
+                <w:noProof/>
+                <w:webHidden/>
+              </w:rPr>
+              <w:fldChar w:fldCharType="separate"/>
+            </w:r>
+            <w:r>
+              <w:rPr>
+                <w:noProof/>
+                <w:webHidden/>
+              </w:rPr>
+              <w:t>5</w:t>
+            </w:r>
+            <w:r>
+              <w:rPr>
+                <w:noProof/>
+                <w:webHidden/>
+              </w:rPr>
+              <w:fldChar w:fldCharType="end"/>
+            </w:r>
+          </w:hyperlink>
+        </w:p>
+        <w:p>
+          <w:pPr>
+            <w:pStyle w:val="TOC1"/>
+            <w:tabs>
+              <w:tab w:val="left" w:pos="400"/>
+              <w:tab w:val="right" w:leader="dot" w:pos="9629"/>
+            </w:tabs>
+            <w:rPr>
+              <w:rFonts w:eastAsiaTheme="minorEastAsia" w:cstheme="minorBidi"/>
+              <w:noProof/>
+              <w:szCs w:val="22"/>
+              <w:lang w:val="nl-BE" w:eastAsia="nl-BE"/>
+            </w:rPr>
+          </w:pPr>
+          <w:hyperlink w:anchor="_Toc83725217" w:history="1">
+            <w:r>
+              <w:rPr>
+                <w:rStyle w:val="Hyperlink"/>
+                <w:noProof/>
+                <w:lang w:val="en-US"/>
+              </w:rPr>
+              <w:t>1</w:t>
+            </w:r>
+            <w:r>
+              <w:rPr>
+                <w:rFonts w:eastAsiaTheme="minorEastAsia" w:cstheme="minorBidi"/>
+                <w:noProof/>
+                <w:szCs w:val="22"/>
+                <w:lang w:val="nl-BE" w:eastAsia="nl-BE"/>
+              </w:rPr>
+              <w:tab/>
+            </w:r>
+            <w:r>
+              <w:rPr>
+                <w:rStyle w:val="Hyperlink"/>
+                <w:noProof/>
+              </w:rPr>
+              <w:t>Heading 1</w:t>
+            </w:r>
+            <w:r>
+              <w:rPr>
+                <w:noProof/>
+                <w:webHidden/>
+              </w:rPr>
+              <w:tab/>
+            </w:r>
+            <w:r>
+              <w:rPr>
+                <w:noProof/>
+                <w:webHidden/>
+              </w:rPr>
+              <w:fldChar w:fldCharType="begin"/>
+            </w:r>
+            <w:r>
+              <w:rPr>
+                <w:noProof/>
+                <w:webHidden/>
+              </w:rPr>
+              <w:instrText xml:space="preserve"> PAGEREF _Toc83725217 \h </w:instrText>
+            </w:r>
+            <w:r>
+              <w:rPr>
+                <w:noProof/>
+                <w:webHidden/>
+              </w:rPr>
+            </w:r>
+            <w:r>
+              <w:rPr>
+                <w:noProof/>
+                <w:webHidden/>
+              </w:rPr>
+              <w:fldChar w:fldCharType="separate"/>
+            </w:r>
+            <w:r>
+              <w:rPr>
+                <w:noProof/>
+                <w:webHidden/>
+              </w:rPr>
+              <w:t>6</w:t>
+            </w:r>
+            <w:r>
+              <w:rPr>
+                <w:noProof/>
+                <w:webHidden/>
+              </w:rPr>
+              <w:fldChar w:fldCharType="end"/>
+            </w:r>
+          </w:hyperlink>
+        </w:p>
+        <w:p>
+          <w:pPr>
+            <w:pStyle w:val="TOC2"/>
+            <w:tabs>
+              <w:tab w:val="left" w:pos="880"/>
+              <w:tab w:val="right" w:leader="dot" w:pos="9629"/>
+            </w:tabs>
+            <w:rPr>
+              <w:rFonts w:eastAsiaTheme="minorEastAsia" w:cstheme="minorBidi"/>
+              <w:noProof/>
+              <w:szCs w:val="22"/>
+              <w:lang w:val="nl-BE" w:eastAsia="nl-BE"/>
+            </w:rPr>
+          </w:pPr>
+          <w:hyperlink w:anchor="_Toc83725218" w:history="1">
+            <w:r>
+              <w:rPr>
+                <w:rStyle w:val="Hyperlink"/>
+                <w:noProof/>
+              </w:rPr>
+              <w:t>1.1</w:t>
+            </w:r>
+            <w:r>
+              <w:rPr>
+                <w:rFonts w:eastAsiaTheme="minorEastAsia" w:cstheme="minorBidi"/>
+                <w:noProof/>
+                <w:szCs w:val="22"/>
+                <w:lang w:val="nl-BE" w:eastAsia="nl-BE"/>
+              </w:rPr>
+              <w:tab/>
+            </w:r>
+            <w:r>
+              <w:rPr>
+                <w:rStyle w:val="Hyperlink"/>
+                <w:noProof/>
+              </w:rPr>
+              <w:t>Heading 2</w:t>
+            </w:r>
+            <w:r>
+              <w:rPr>
+                <w:noProof/>
+                <w:webHidden/>
+              </w:rPr>
+              <w:tab/>
+            </w:r>
+            <w:r>
+              <w:rPr>
+                <w:noProof/>
+                <w:webHidden/>
+              </w:rPr>
+              <w:fldChar w:fldCharType="begin"/>
+            </w:r>
+            <w:r>
+              <w:rPr>
+                <w:noProof/>
+                <w:webHidden/>
+              </w:rPr>
+              <w:instrText xml:space="preserve"> PAGEREF _Toc83725218 \h </w:instrText>
+            </w:r>
+            <w:r>
+              <w:rPr>
+                <w:noProof/>
+                <w:webHidden/>
+              </w:rPr>
+            </w:r>
+            <w:r>
+              <w:rPr>
+                <w:noProof/>
+                <w:webHidden/>
+              </w:rPr>
+              <w:fldChar w:fldCharType="separate"/>
+            </w:r>
+            <w:r>
+              <w:rPr>
+                <w:noProof/>
+                <w:webHidden/>
+              </w:rPr>
+              <w:t>6</w:t>
+            </w:r>
+            <w:r>
+              <w:rPr>
+                <w:noProof/>
+                <w:webHidden/>
+              </w:rPr>
+              <w:fldChar w:fldCharType="end"/>
+            </w:r>
+          </w:hyperlink>
+        </w:p>
+        <w:p>
+          <w:pPr>
+            <w:pStyle w:val="TOC3"/>
+            <w:tabs>
+              <w:tab w:val="left" w:pos="1100"/>
+              <w:tab w:val="right" w:leader="dot" w:pos="9629"/>
+            </w:tabs>
+            <w:rPr>
+              <w:rFonts w:eastAsiaTheme="minorEastAsia" w:cstheme="minorBidi"/>
+              <w:noProof/>
+              <w:szCs w:val="22"/>
+              <w:lang w:val="nl-BE" w:eastAsia="nl-BE"/>
+            </w:rPr>
+          </w:pPr>
+          <w:hyperlink w:anchor="_Toc83725219" w:history="1">
+            <w:r>
+              <w:rPr>
+                <w:rStyle w:val="Hyperlink"/>
+                <w:rFonts w:cstheme="minorHAnsi"/>
+                <w:noProof/>
+                <w:snapToGrid w:val="0"/>
+                <w:w w:val="0"/>
+              </w:rPr>
+              <w:t>1.1.1</w:t>
+            </w:r>
+            <w:r>
+              <w:rPr>
+                <w:rFonts w:eastAsiaTheme="minorEastAsia" w:cstheme="minorBidi"/>
+                <w:noProof/>
+                <w:szCs w:val="22"/>
+                <w:lang w:val="nl-BE" w:eastAsia="nl-BE"/>
+              </w:rPr>
+              <w:tab/>
+            </w:r>
+            <w:r>
+              <w:rPr>
+                <w:rStyle w:val="Hyperlink"/>
+                <w:noProof/>
+              </w:rPr>
+              <w:t>Heading 3</w:t>
+            </w:r>
+            <w:r>
+              <w:rPr>
+                <w:noProof/>
+                <w:webHidden/>
+              </w:rPr>
+              <w:tab/>
+            </w:r>
+            <w:r>
+              <w:rPr>
+                <w:noProof/>
+                <w:webHidden/>
+              </w:rPr>
+              <w:fldChar w:fldCharType="begin"/>
+            </w:r>
+            <w:r>
+              <w:rPr>
+                <w:noProof/>
+                <w:webHidden/>
+              </w:rPr>
+              <w:instrText xml:space="preserve"> PAGEREF _Toc83725219 \h </w:instrText>
+            </w:r>
+            <w:r>
+              <w:rPr>
+                <w:noProof/>
+                <w:webHidden/>
+              </w:rPr>
+            </w:r>
+            <w:r>
+              <w:rPr>
+                <w:noProof/>
+                <w:webHidden/>
+              </w:rPr>
+              <w:fldChar w:fldCharType="separate"/>
+            </w:r>
+            <w:r>
+              <w:rPr>
+                <w:noProof/>
+                <w:webHidden/>
+              </w:rPr>
+              <w:t>6</w:t>
+            </w:r>
+            <w:r>
+              <w:rPr>
+                <w:noProof/>
+                <w:webHidden/>
+              </w:rPr>
+              <w:fldChar w:fldCharType="end"/>
+            </w:r>
+          </w:hyperlink>
+        </w:p>
+        <w:p>
+          <w:pPr>
+            <w:pStyle w:val="TOC1"/>
+            <w:tabs>
+              <w:tab w:val="left" w:pos="400"/>
+              <w:tab w:val="right" w:leader="dot" w:pos="9629"/>
+            </w:tabs>
+            <w:rPr>
+              <w:rFonts w:eastAsiaTheme="minorEastAsia" w:cstheme="minorBidi"/>
+              <w:noProof/>
+              <w:szCs w:val="22"/>
+              <w:lang w:val="nl-BE" w:eastAsia="nl-BE"/>
+            </w:rPr>
+          </w:pPr>
+          <w:hyperlink w:anchor="_Toc83725220" w:history="1">
+            <w:r>
+              <w:rPr>
+                <w:rStyle w:val="Hyperlink"/>
+                <w:noProof/>
+                <w:lang w:val="en-US"/>
+              </w:rPr>
+              <w:t>2</w:t>
+            </w:r>
+            <w:r>
+              <w:rPr>
+                <w:rFonts w:eastAsiaTheme="minorEastAsia" w:cstheme="minorBidi"/>
+                <w:noProof/>
+                <w:szCs w:val="22"/>
+                <w:lang w:val="nl-BE" w:eastAsia="nl-BE"/>
+              </w:rPr>
+              <w:tab/>
+            </w:r>
+            <w:r>
+              <w:rPr>
+                <w:rStyle w:val="Hyperlink"/>
+                <w:noProof/>
+                <w:lang w:val="en-US"/>
+              </w:rPr>
+              <w:t>Figures</w:t>
+            </w:r>
+            <w:r>
+              <w:rPr>
+                <w:noProof/>
+                <w:webHidden/>
+              </w:rPr>
+              <w:tab/>
+            </w:r>
+            <w:r>
+              <w:rPr>
+                <w:noProof/>
+                <w:webHidden/>
+              </w:rPr>
+              <w:fldChar w:fldCharType="begin"/>
+            </w:r>
+            <w:r>
+              <w:rPr>
+                <w:noProof/>
+                <w:webHidden/>
+              </w:rPr>
+              <w:instrText xml:space="preserve"> PAGEREF _Toc83725220 \h </w:instrText>
+            </w:r>
+            <w:r>
+              <w:rPr>
+                <w:noProof/>
+                <w:webHidden/>
+              </w:rPr>
+            </w:r>
+            <w:r>
+              <w:rPr>
+                <w:noProof/>
+                <w:webHidden/>
+              </w:rPr>
+              <w:fldChar w:fldCharType="separate"/>
+            </w:r>
+            <w:r>
+              <w:rPr>
+                <w:noProof/>
+                <w:webHidden/>
+              </w:rPr>
+              <w:t>7</w:t>
+            </w:r>
+            <w:r>
+              <w:rPr>
+                <w:noProof/>
+                <w:webHidden/>
+              </w:rPr>
+              <w:fldChar w:fldCharType="end"/>
+            </w:r>
+          </w:hyperlink>
+        </w:p>
+        <w:p>
+          <w:pPr>
+            <w:pStyle w:val="TOC1"/>
+            <w:tabs>
+              <w:tab w:val="left" w:pos="400"/>
+              <w:tab w:val="right" w:leader="dot" w:pos="9629"/>
+            </w:tabs>
+            <w:rPr>
+              <w:rFonts w:eastAsiaTheme="minorEastAsia" w:cstheme="minorBidi"/>
+              <w:noProof/>
+              <w:szCs w:val="22"/>
+              <w:lang w:val="nl-BE" w:eastAsia="nl-BE"/>
+            </w:rPr>
+          </w:pPr>
+          <w:hyperlink w:anchor="_Toc83725221" w:history="1">
+            <w:r>
+              <w:rPr>
+                <w:rStyle w:val="Hyperlink"/>
+                <w:noProof/>
+                <w:lang w:val="en-US" w:eastAsia="en-US"/>
+              </w:rPr>
+              <w:t>3</w:t>
+            </w:r>
+            <w:r>
+              <w:rPr>
+                <w:rFonts w:eastAsiaTheme="minorEastAsia" w:cstheme="minorBidi"/>
+                <w:noProof/>
+                <w:szCs w:val="22"/>
+                <w:lang w:val="nl-BE" w:eastAsia="nl-BE"/>
+              </w:rPr>
+              <w:tab/>
+            </w:r>
+            <w:r>
+              <w:rPr>
+                <w:rStyle w:val="Hyperlink"/>
+                <w:noProof/>
+                <w:lang w:val="en-US" w:eastAsia="en-US"/>
+              </w:rPr>
+              <w:t>Tables</w:t>
+            </w:r>
+            <w:r>
+              <w:rPr>
+                <w:noProof/>
+                <w:webHidden/>
+              </w:rPr>
+              <w:tab/>
+            </w:r>
+            <w:r>
+              <w:rPr>
+                <w:noProof/>
+                <w:webHidden/>
+              </w:rPr>
+              <w:fldChar w:fldCharType="begin"/>
+            </w:r>
+            <w:r>
+              <w:rPr>
+                <w:noProof/>
+                <w:webHidden/>
+              </w:rPr>
+              <w:instrText xml:space="preserve"> PAGEREF _Toc83725221 \h </w:instrText>
+            </w:r>
+            <w:r>
+              <w:rPr>
+                <w:noProof/>
+                <w:webHidden/>
+              </w:rPr>
+            </w:r>
+            <w:r>
+              <w:rPr>
+                <w:noProof/>
+                <w:webHidden/>
+              </w:rPr>
+              <w:fldChar w:fldCharType="separate"/>
+            </w:r>
+            <w:r>
+              <w:rPr>
+                <w:noProof/>
+                <w:webHidden/>
+              </w:rPr>
+              <w:t>8</w:t>
+            </w:r>
+            <w:r>
+              <w:rPr>
+                <w:noProof/>
+                <w:webHidden/>
+              </w:rPr>
+              <w:fldChar w:fldCharType="end"/>
+            </w:r>
+          </w:hyperlink>
+        </w:p>
+        <w:p>
+          <w:pPr>
+            <w:pStyle w:val="TOC1"/>
+            <w:tabs>
+              <w:tab w:val="right" w:leader="dot" w:pos="9629"/>
+            </w:tabs>
+            <w:rPr>
+              <w:rFonts w:eastAsiaTheme="minorEastAsia" w:cstheme="minorBidi"/>
+              <w:noProof/>
+              <w:szCs w:val="22"/>
+              <w:lang w:val="nl-BE" w:eastAsia="nl-BE"/>
+            </w:rPr>
+          </w:pPr>
+          <w:hyperlink w:anchor="_Toc83725222" w:history="1">
+            <w:r>
+              <w:rPr>
+                <w:rStyle w:val="Hyperlink"/>
+                <w:noProof/>
+              </w:rPr>
+              <w:t>Bibliography</w:t>
+            </w:r>
+            <w:r>
+              <w:rPr>
+                <w:noProof/>
+                <w:webHidden/>
+              </w:rPr>
+              <w:tab/>
+            </w:r>
+            <w:r>
+              <w:rPr>
+                <w:noProof/>
+                <w:webHidden/>
+              </w:rPr>
+              <w:fldChar w:fldCharType="begin"/>
+            </w:r>
+            <w:r>
+              <w:rPr>
+                <w:noProof/>
+                <w:webHidden/>
+              </w:rPr>
+              <w:instrText xml:space="preserve"> PAGEREF _Toc83725222 \h </w:instrText>
+            </w:r>
+            <w:r>
+              <w:rPr>
+                <w:noProof/>
+                <w:webHidden/>
+              </w:rPr>
+            </w:r>
+            <w:r>
+              <w:rPr>
+                <w:noProof/>
+                <w:webHidden/>
+              </w:rPr>
+              <w:fldChar w:fldCharType="separate"/>
+            </w:r>
+            <w:r>
+              <w:rPr>
+                <w:noProof/>
+                <w:webHidden/>
+              </w:rPr>
+              <w:t>10</w:t>
+            </w:r>
+            <w:r>
+              <w:rPr>
+                <w:noProof/>
+                <w:webHidden/>
+              </w:rPr>
+              <w:fldChar w:fldCharType="end"/>
+            </w:r>
+          </w:hyperlink>
+        </w:p>
+        <w:p>
+          <w:pPr>
+            <w:pStyle w:val="TOC1"/>
+            <w:tabs>
+              <w:tab w:val="right" w:leader="dot" w:pos="9629"/>
+            </w:tabs>
+            <w:rPr>
+              <w:rFonts w:eastAsiaTheme="minorEastAsia" w:cstheme="minorBidi"/>
+              <w:noProof/>
+              <w:szCs w:val="22"/>
+              <w:lang w:val="nl-BE" w:eastAsia="nl-BE"/>
+            </w:rPr>
+          </w:pPr>
+          <w:hyperlink w:anchor="_Toc83725223" w:history="1">
+            <w:r>
+              <w:rPr>
+                <w:rStyle w:val="Hyperlink"/>
+                <w:noProof/>
+              </w:rPr>
+              <w:t>List of Acronyms</w:t>
+            </w:r>
+            <w:r>
+              <w:rPr>
+                <w:noProof/>
+                <w:webHidden/>
+              </w:rPr>
+              <w:tab/>
+            </w:r>
+            <w:r>
+              <w:rPr>
+                <w:noProof/>
+                <w:webHidden/>
+              </w:rPr>
+              <w:fldChar w:fldCharType="begin"/>
+            </w:r>
+            <w:r>
+              <w:rPr>
+                <w:noProof/>
+                <w:webHidden/>
+              </w:rPr>
+              <w:instrText xml:space="preserve"> PAGEREF _Toc83725223 \h </w:instrText>
+            </w:r>
+            <w:r>
+              <w:rPr>
+                <w:noProof/>
+                <w:webHidden/>
+              </w:rPr>
+            </w:r>
+            <w:r>
+              <w:rPr>
+                <w:noProof/>
+                <w:webHidden/>
+              </w:rPr>
+              <w:fldChar w:fldCharType="separate"/>
+            </w:r>
+            <w:r>
+              <w:rPr>
+                <w:noProof/>
+                <w:webHidden/>
+              </w:rPr>
+              <w:t>11</w:t>
+            </w:r>
+            <w:r>
+              <w:rPr>
+                <w:noProof/>
+                <w:webHidden/>
+              </w:rPr>
+              <w:fldChar w:fldCharType="end"/>
+            </w:r>
+          </w:hyperlink>
+        </w:p>
+        <w:p>
+          <w:pPr>
+            <w:pStyle w:val="TOC1"/>
+            <w:tabs>
+              <w:tab w:val="left" w:pos="1320"/>
+              <w:tab w:val="right" w:leader="dot" w:pos="9629"/>
+            </w:tabs>
+            <w:rPr>
+              <w:rFonts w:eastAsiaTheme="minorEastAsia" w:cstheme="minorBidi"/>
+              <w:noProof/>
+              <w:szCs w:val="22"/>
+              <w:lang w:val="nl-BE" w:eastAsia="nl-BE"/>
+            </w:rPr>
+          </w:pPr>
+          <w:hyperlink w:anchor="_Toc83725224" w:history="1">
+            <w:r>
+              <w:rPr>
+                <w:rStyle w:val="Hyperlink"/>
+                <w:noProof/>
+              </w:rPr>
+              <w:t>Appendix A</w:t>
+            </w:r>
+            <w:r>
+              <w:rPr>
+                <w:rFonts w:eastAsiaTheme="minorEastAsia" w:cstheme="minorBidi"/>
+                <w:noProof/>
+                <w:szCs w:val="22"/>
+                <w:lang w:val="nl-BE" w:eastAsia="nl-BE"/>
+              </w:rPr>
+              <w:tab/>
+            </w:r>
+            <w:r>
+              <w:rPr>
+                <w:rStyle w:val="Hyperlink"/>
+                <w:noProof/>
+              </w:rPr>
+              <w:t>Style – Appendix 1</w:t>
+            </w:r>
+            <w:r>
+              <w:rPr>
+                <w:noProof/>
+                <w:webHidden/>
+              </w:rPr>
+              <w:tab/>
+            </w:r>
+            <w:r>
+              <w:rPr>
+                <w:noProof/>
+                <w:webHidden/>
+              </w:rPr>
+              <w:fldChar w:fldCharType="begin"/>
+            </w:r>
+            <w:r>
+              <w:rPr>
+                <w:noProof/>
+                <w:webHidden/>
+              </w:rPr>
+              <w:instrText xml:space="preserve"> PAGEREF _Toc83725224 \h </w:instrText>
+            </w:r>
+            <w:r>
+              <w:rPr>
+                <w:noProof/>
+                <w:webHidden/>
+              </w:rPr>
+            </w:r>
+            <w:r>
+              <w:rPr>
+                <w:noProof/>
+                <w:webHidden/>
+              </w:rPr>
+              <w:fldChar w:fldCharType="separate"/>
+            </w:r>
+            <w:r>
+              <w:rPr>
+                <w:noProof/>
+                <w:webHidden/>
+              </w:rPr>
+              <w:t>12</w:t>
+            </w:r>
+            <w:r>
+              <w:rPr>
+                <w:noProof/>
+                <w:webHidden/>
+              </w:rPr>
+              <w:fldChar w:fldCharType="end"/>
+            </w:r>
+          </w:hyperlink>
+        </w:p>
+        <w:p>
+          <w:pPr>
+            <w:pStyle w:val="TOC2"/>
+            <w:tabs>
+              <w:tab w:val="left" w:pos="880"/>
+              <w:tab w:val="right" w:leader="dot" w:pos="9629"/>
+            </w:tabs>
+            <w:rPr>
+              <w:rFonts w:eastAsiaTheme="minorEastAsia" w:cstheme="minorBidi"/>
+              <w:noProof/>
+              <w:szCs w:val="22"/>
+              <w:lang w:val="nl-BE" w:eastAsia="nl-BE"/>
+            </w:rPr>
+          </w:pPr>
+          <w:hyperlink w:anchor="_Toc83725225" w:history="1">
+            <w:r>
+              <w:rPr>
+                <w:rStyle w:val="Hyperlink"/>
+                <w:noProof/>
+                <w:lang w:eastAsia="en-US"/>
+              </w:rPr>
+              <w:t>A.1</w:t>
+            </w:r>
+            <w:r>
+              <w:rPr>
+                <w:rFonts w:eastAsiaTheme="minorEastAsia" w:cstheme="minorBidi"/>
+                <w:noProof/>
+                <w:szCs w:val="22"/>
+                <w:lang w:val="nl-BE" w:eastAsia="nl-BE"/>
+              </w:rPr>
+              <w:tab/>
+            </w:r>
+            <w:r>
+              <w:rPr>
+                <w:rStyle w:val="Hyperlink"/>
+                <w:noProof/>
+                <w:lang w:eastAsia="en-US"/>
+              </w:rPr>
+              <w:t>Style appendix 2</w:t>
+            </w:r>
+            <w:r>
+              <w:rPr>
+                <w:noProof/>
+                <w:webHidden/>
+              </w:rPr>
+              <w:tab/>
+            </w:r>
+            <w:r>
+              <w:rPr>
+                <w:noProof/>
+                <w:webHidden/>
+              </w:rPr>
+              <w:fldChar w:fldCharType="begin"/>
+            </w:r>
+            <w:r>
+              <w:rPr>
+                <w:noProof/>
+                <w:webHidden/>
+              </w:rPr>
+              <w:instrText xml:space="preserve"> PAGEREF _Toc83725225 \h </w:instrText>
+            </w:r>
+            <w:r>
+              <w:rPr>
+                <w:noProof/>
+                <w:webHidden/>
+              </w:rPr>
+            </w:r>
+            <w:r>
+              <w:rPr>
+                <w:noProof/>
+                <w:webHidden/>
+              </w:rPr>
+              <w:fldChar w:fldCharType="separate"/>
+            </w:r>
+            <w:r>
+              <w:rPr>
+                <w:noProof/>
+                <w:webHidden/>
+              </w:rPr>
+              <w:t>12</w:t>
+            </w:r>
+            <w:r>
+              <w:rPr>
+                <w:noProof/>
+                <w:webHidden/>
+              </w:rPr>
+              <w:fldChar w:fldCharType="end"/>
+            </w:r>
+          </w:hyperlink>
+        </w:p>
+        <w:p>
+          <w:r>
+            <w:rPr>
+              <w:b/>
+              <w:bCs/>
+              <w:noProof/>
+            </w:rPr>
+            <w:fldChar w:fldCharType="end"/>
+          </w:r>
+        </w:p>
+      </w:sdtContent>
+    </w:sdt>
+    <w:p/>
+    <w:p/>
+    <w:p/>
+    <w:p>
+      <w:pPr>
+        <w:pStyle w:val="Heading1-nonumber"/>
+      </w:pPr>
+      <w:bookmarkStart w:id="5" w:name="_Toc83725215"/>
+      <w:r>
+        <w:lastRenderedPageBreak/>
+        <w:t>List</w:t>
+      </w:r>
+      <w:r>
+        <w:t xml:space="preserve"> of Figures</w:t>
+      </w:r>
+      <w:bookmarkEnd w:id="5"/>
+    </w:p>
+    <w:p>
+      <w:pPr>
+        <w:pStyle w:val="TableofFigures"/>
+        <w:tabs>
+          <w:tab w:val="right" w:leader="dot" w:pos="9629"/>
+        </w:tabs>
+        <w:rPr>
+          <w:rFonts w:eastAsiaTheme="minorEastAsia" w:cstheme="minorBidi"/>
+          <w:noProof/>
+          <w:szCs w:val="22"/>
+          <w:lang w:val="nl-BE" w:eastAsia="nl-BE"/>
+        </w:rPr>
+      </w:pPr>
+      <w:r>
+        <w:fldChar w:fldCharType="begin"/>
+      </w:r>
+      <w:r>
+        <w:instrText xml:space="preserve"> TOC \h \z \c "Figure" </w:instrText>
+      </w:r>
+      <w:r>
+        <w:fldChar w:fldCharType="separate"/>
+      </w:r>
+      <w:hyperlink w:anchor="_Toc75114946" w:history="1">
+        <w:r>
+          <w:rPr>
+            <w:rStyle w:val="Hyperlink"/>
+            <w:noProof/>
+          </w:rPr>
+          <w:t>Figure 1: Caption below the figure</w:t>
+        </w:r>
+        <w:r>
+          <w:rPr>
+            <w:noProof/>
+            <w:webHidden/>
+          </w:rPr>
+          <w:tab/>
+        </w:r>
+        <w:r>
+          <w:rPr>
+            <w:noProof/>
+            <w:webHidden/>
+          </w:rPr>
+          <w:fldChar w:fldCharType="begin"/>
+        </w:r>
+        <w:r>
+          <w:rPr>
+            <w:noProof/>
+            <w:webHidden/>
+          </w:rPr>
+          <w:instrText xml:space="preserve"> PAGEREF _Toc75114946 \h </w:instrText>
+        </w:r>
+        <w:r>
+          <w:rPr>
+            <w:noProof/>
+            <w:webHidden/>
+          </w:rPr>
+        </w:r>
+        <w:r>
+          <w:rPr>
+            <w:noProof/>
+            <w:webHidden/>
+          </w:rPr>
+          <w:fldChar w:fldCharType="separate"/>
+        </w:r>
+        <w:r>
+          <w:rPr>
+            <w:noProof/>
+            <w:webHidden/>
+          </w:rPr>
+          <w:t>2</w:t>
+        </w:r>
+        <w:r>
+          <w:rPr>
+            <w:noProof/>
+            <w:webHidden/>
+          </w:rPr>
+          <w:fldChar w:fldCharType="end"/>
+        </w:r>
+      </w:hyperlink>
+    </w:p>
+    <w:p>
+      <w:r>
+        <w:fldChar w:fldCharType="end"/>
+      </w:r>
+    </w:p>
+    <w:p/>
+    <w:p>
+      <w:pPr>
+        <w:pStyle w:val="Heading1-nonumber"/>
+      </w:pPr>
+      <w:bookmarkStart w:id="6" w:name="_Toc83725216"/>
+      <w:r>
+        <w:lastRenderedPageBreak/>
+        <w:t>List of Tables</w:t>
+      </w:r>
+      <w:bookmarkEnd w:id="6"/>
+    </w:p>
+    <w:p>
+      <w:pPr>
+        <w:pStyle w:val="TableofFigures"/>
+        <w:tabs>
+          <w:tab w:val="right" w:leader="dot" w:pos="9629"/>
+        </w:tabs>
+        <w:rPr>
+          <w:rFonts w:eastAsiaTheme="minorEastAsia" w:cstheme="minorBidi"/>
+          <w:noProof/>
+          <w:szCs w:val="22"/>
+          <w:lang w:val="nl-BE" w:eastAsia="nl-BE"/>
+        </w:rPr>
+      </w:pPr>
+      <w:r>
+        <w:fldChar w:fldCharType="begin"/>
+      </w:r>
+      <w:r>
+        <w:instrText xml:space="preserve"> TOC \h \z \c "Table" </w:instrText>
+      </w:r>
+      <w:r>
+        <w:fldChar w:fldCharType="separate"/>
+      </w:r>
+      <w:hyperlink w:anchor="_Toc76116458" w:history="1">
+        <w:r>
+          <w:rPr>
+            <w:rStyle w:val="Hyperlink"/>
+            <w:noProof/>
+          </w:rPr>
+          <w:t>Table 1: Table caption above table</w:t>
+        </w:r>
+        <w:r>
+          <w:rPr>
+            <w:noProof/>
+            <w:webHidden/>
+          </w:rPr>
+          <w:tab/>
+        </w:r>
+        <w:r>
+          <w:rPr>
+            <w:noProof/>
+            <w:webHidden/>
+          </w:rPr>
+          <w:fldChar w:fldCharType="begin"/>
+        </w:r>
+        <w:r>
+          <w:rPr>
+            <w:noProof/>
+            <w:webHidden/>
+          </w:rPr>
+          <w:instrText xml:space="preserve"> PAGEREF _Toc76116458 \h </w:instrText>
+        </w:r>
+        <w:r>
+          <w:rPr>
+            <w:noProof/>
+            <w:webHidden/>
+          </w:rPr>
+        </w:r>
+        <w:r>
+          <w:rPr>
+            <w:noProof/>
+            <w:webHidden/>
+          </w:rPr>
+          <w:fldChar w:fldCharType="separate"/>
+        </w:r>
+        <w:r>
+          <w:rPr>
+            <w:noProof/>
+            <w:webHidden/>
+          </w:rPr>
+          <w:t>7</w:t>
+        </w:r>
+        <w:r>
+          <w:rPr>
+            <w:noProof/>
+            <w:webHidden/>
+          </w:rPr>
+          <w:fldChar w:fldCharType="end"/>
+        </w:r>
+      </w:hyperlink>
+    </w:p>
+    <w:p>
+      <w:r>
+        <w:fldChar w:fldCharType="end"/>
+      </w:r>
+    </w:p>
     <w:p>
       <w:pPr>
         <w:pStyle w:val="Title"/>
@@ -567,7 +1878,7 @@
         <w:pStyle w:val="Heading1"/>
       </w:pPr>
       <w:r>
-        <w:t>1. Revision History</w:t>
+        <w:t>Revision History</w:t>
       </w:r>
     </w:p>
     <w:tbl>
@@ -772,205 +2083,7 @@
         <w:pStyle w:val="Heading1"/>
       </w:pPr>
       <w:r>
-        <w:t>2. List of Figures</w:t>
-      </w:r>
-    </w:p>
-    <w:p>
-      <w:pPr>
-        <w:pStyle w:val="ListParagraph"/>
-      </w:pPr>
-      <w:r>
-        <w:rPr>
-          <w:rFonts w:ascii="Calibri" w:hAnsi="Calibri"/>
-          <w:b w:val="0"/>
-          <w:sz w:val="22"/>
-        </w:rPr>
-        <w:t>Figure 1: Vision Series: three-step verification rail</w:t>
-      </w:r>
-    </w:p>
-    <w:p>
-      <w:pPr>
-        <w:pStyle w:val="ListParagraph"/>
-      </w:pPr>
-      <w:r>
-        <w:rPr>
-          <w:rFonts w:ascii="Calibri" w:hAnsi="Calibri"/>
-          <w:b w:val="0"/>
-          <w:sz w:val="22"/>
-        </w:rPr>
-        <w:t>Figure 2: MAG-IMG002x1-NC Production Test Flow</w:t>
-      </w:r>
-    </w:p>
-    <w:p>
-      <w:pPr>
-        <w:pStyle w:val="ListParagraph"/>
-      </w:pPr>
-      <w:r>
-        <w:rPr>
-          <w:rFonts w:ascii="Calibri" w:hAnsi="Calibri"/>
-          <w:b w:val="0"/>
-          <w:sz w:val="22"/>
-        </w:rPr>
-        <w:t>Figure 3: MAG-IMG002x1-NC Trim Test Flow</w:t>
-      </w:r>
-    </w:p>
-    <w:p>
-      <w:pPr>
-        <w:pStyle w:val="ListParagraph"/>
-      </w:pPr>
-      <w:r>
-        <w:rPr>
-          <w:rFonts w:ascii="Calibri" w:hAnsi="Calibri"/>
-          <w:b w:val="0"/>
-          <w:sz w:val="22"/>
-        </w:rPr>
-        <w:t>Figure 4: MAG-CXP00002-NP Production Test Flow</w:t>
-      </w:r>
-    </w:p>
-    <w:p>
-      <w:pPr>
-        <w:pStyle w:val="ListParagraph"/>
-      </w:pPr>
-      <w:r>
-        <w:rPr>
-          <w:rFonts w:ascii="Calibri" w:hAnsi="Calibri"/>
-          <w:b w:val="0"/>
-          <w:sz w:val="22"/>
-        </w:rPr>
-        <w:t>Figure 5: MAG-PSU00001-NP Production Test Flow</w:t>
-      </w:r>
-    </w:p>
-    <w:p>
-      <w:pPr>
-        <w:pStyle w:val="ListParagraph"/>
-      </w:pPr>
-      <w:r>
-        <w:rPr>
-          <w:rFonts w:ascii="Calibri" w:hAnsi="Calibri"/>
-          <w:b w:val="0"/>
-          <w:sz w:val="22"/>
-        </w:rPr>
-        <w:t>Figure 6: MAG-VIS4000x-N Production Test Flow</w:t>
-      </w:r>
-    </w:p>
-    <w:p>
-      <w:pPr>
-        <w:pStyle w:val="ListParagraph"/>
-      </w:pPr>
-      <w:r>
-        <w:rPr>
-          <w:rFonts w:ascii="Calibri" w:hAnsi="Calibri"/>
-          <w:b w:val="0"/>
-          <w:sz w:val="22"/>
-        </w:rPr>
-        <w:t>Figure 7: MAG-VIS4003x-N Production Test Flow</w:t>
-      </w:r>
-    </w:p>
-    <w:p>
-      <w:pPr>
-        <w:pStyle w:val="ListParagraph"/>
-      </w:pPr>
-      <w:r>
-        <w:rPr>
-          <w:rFonts w:ascii="Calibri" w:hAnsi="Calibri"/>
-          <w:b w:val="0"/>
-          <w:sz w:val="22"/>
-        </w:rPr>
-        <w:t>Figure 8: MAG-VIS4001x-N Production Test Flow</w:t>
-      </w:r>
-    </w:p>
-    <w:p>
-      <w:pPr>
-        <w:pStyle w:val="ListParagraph"/>
-      </w:pPr>
-      <w:r>
-        <w:rPr>
-          <w:rFonts w:ascii="Calibri" w:hAnsi="Calibri"/>
-          <w:b w:val="0"/>
-          <w:sz w:val="22"/>
-        </w:rPr>
-        <w:t>Figure 9: MAG-VIS100xx-N Production Test Flow</w:t>
-      </w:r>
-    </w:p>
-    <w:p>
-      <w:pPr>
-        <w:pStyle w:val="Heading1"/>
-      </w:pPr>
-      <w:r>
-        <w:t>3. List of Tables</w:t>
-      </w:r>
-    </w:p>
-    <w:p>
-      <w:pPr>
-        <w:pStyle w:val="ListParagraph"/>
-      </w:pPr>
-      <w:r>
-        <w:rPr>
-          <w:rFonts w:ascii="Calibri" w:hAnsi="Calibri"/>
-          <w:b w:val="0"/>
-          <w:sz w:val="22"/>
-        </w:rPr>
-        <w:t>Table 1: MAG-IMG002X1-NC Key Specifications</w:t>
-      </w:r>
-    </w:p>
-    <w:p>
-      <w:pPr>
-        <w:pStyle w:val="ListParagraph"/>
-      </w:pPr>
-      <w:r>
-        <w:rPr>
-          <w:rFonts w:ascii="Calibri" w:hAnsi="Calibri"/>
-          <w:b w:val="0"/>
-          <w:sz w:val="22"/>
-        </w:rPr>
-        <w:t>Table 1b: MAG-IMG002X1-NC Electro-Optical Test Parameters (T0038)</w:t>
-      </w:r>
-    </w:p>
-    <w:p>
-      <w:pPr>
-        <w:pStyle w:val="ListParagraph"/>
-      </w:pPr>
-      <w:r>
-        <w:rPr>
-          <w:rFonts w:ascii="Calibri" w:hAnsi="Calibri"/>
-          <w:b w:val="0"/>
-          <w:sz w:val="22"/>
-        </w:rPr>
-        <w:t>Table 2: MAG-CXP00002-NP Key Specifications</w:t>
-      </w:r>
-    </w:p>
-    <w:p>
-      <w:pPr>
-        <w:pStyle w:val="ListParagraph"/>
-      </w:pPr>
-      <w:r>
-        <w:rPr>
-          <w:rFonts w:ascii="Calibri" w:hAnsi="Calibri"/>
-          <w:b w:val="0"/>
-          <w:sz w:val="22"/>
-        </w:rPr>
-        <w:t>Table 3: MAG-PSU00001-NP Key Specifications</w:t>
-      </w:r>
-    </w:p>
-    <w:p>
-      <w:pPr>
-        <w:pStyle w:val="ListParagraph"/>
-      </w:pPr>
-      <w:r>
-        <w:rPr>
-          <w:rFonts w:ascii="Calibri" w:hAnsi="Calibri"/>
-          <w:b w:val="0"/>
-          <w:sz w:val="22"/>
-        </w:rPr>
-        <w:t>Table 4: MAG-VIS100xx-N Key Specifications</w:t>
-      </w:r>
-    </w:p>
-    <w:p>
-      <w:pPr>
-        <w:pStyle w:val="Heading1"/>
-      </w:pPr>
-      <w:r>
-        <w:t>4. Introduction &amp; Scope</w:t>
+        <w:t>Introduction &amp; Scope</w:t>
       </w:r>
     </w:p>
     <w:p>
@@ -999,7 +2112,7 @@
         <w:pStyle w:val="Heading1"/>
       </w:pPr>
       <w:r>
-        <w:t>5. Vision products verification process</w:t>
+        <w:t>Vision products verification process</w:t>
       </w:r>
     </w:p>
     <w:p>
@@ -1053,15 +2166,28 @@
     </w:p>
     <w:p>
       <w:pPr>
-        <w:jc w:val="center"/>
+        <w:pStyle w:val="Caption"/>
       </w:pPr>
       <w:r>
-        <w:rPr>
-          <w:i/>
-          <w:color w:val="64748B"/>
-          <w:sz w:val="18"/>
-        </w:rPr>
-        <w:t>Figure 1: Vision Series: three-step verification rail</w:t>
+        <w:t xml:space="preserve">Figure </w:t>
+      </w:r>
+      <w:r>
+        <w:fldChar w:fldCharType="begin"/>
+      </w:r>
+      <w:r>
+        <w:instrText xml:space="preserve"> SEQ Figure \* ARABIC </w:instrText>
+      </w:r>
+      <w:r>
+        <w:fldChar w:fldCharType="separate"/>
+      </w:r>
+      <w:r>
+        <w:t>#</w:t>
+      </w:r>
+      <w:r>
+        <w:fldChar w:fldCharType="end"/>
+      </w:r>
+      <w:r>
+        <w:t>: Vision Series: three-step verification rail</w:t>
       </w:r>
     </w:p>
     <w:p>
@@ -1069,7 +2195,7 @@
         <w:pStyle w:val="Heading2"/>
       </w:pPr>
       <w:r>
-        <w:t>5.1 Level 1: Component verification</w:t>
+        <w:t>Level 1: Component verification</w:t>
       </w:r>
     </w:p>
     <w:p>
@@ -1140,7 +2266,7 @@
         <w:pStyle w:val="Heading2"/>
       </w:pPr>
       <w:r>
-        <w:t>5.2 Level 2: PCB verification</w:t>
+        <w:t>Level 2: PCB verification</w:t>
       </w:r>
     </w:p>
     <w:p>
@@ -1211,7 +2337,7 @@
         <w:pStyle w:val="Heading2"/>
       </w:pPr>
       <w:r>
-        <w:t>5.3 Level 3: Module verification</w:t>
+        <w:t>Level 3: Module verification</w:t>
       </w:r>
     </w:p>
     <w:p>
@@ -1283,7 +2409,7 @@
         <w:pStyle w:val="Heading1"/>
       </w:pPr>
       <w:r>
-        <w:t>6. Test specifications</w:t>
+        <w:t>Test specifications</w:t>
       </w:r>
     </w:p>
     <w:p>
@@ -1311,7 +2437,7 @@
         <w:pStyle w:val="Heading2"/>
       </w:pPr>
       <w:r>
-        <w:t>6.1 Level 1: IC Test Specifications</w:t>
+        <w:t>Level 1: IC Test Specifications</w:t>
       </w:r>
     </w:p>
     <w:p>
@@ -1329,7 +2455,7 @@
         <w:pStyle w:val="Heading3"/>
       </w:pPr>
       <w:r>
-        <w:t>6.1.1 MAG-IMG002x1-NC (Image Sensor IC)</w:t>
+        <w:t>MAG-IMG002x1-NC (Image Sensor IC)</w:t>
       </w:r>
     </w:p>
     <w:p>
@@ -1391,15 +2517,28 @@
     </w:p>
     <w:p>
       <w:pPr>
-        <w:jc w:val="center"/>
+        <w:pStyle w:val="Caption"/>
       </w:pPr>
       <w:r>
-        <w:rPr>
-          <w:i/>
-          <w:color w:val="64748B"/>
-          <w:sz w:val="18"/>
-        </w:rPr>
-        <w:t>Figure 2: MAG-IMG002x1-NC Production Test Flow</w:t>
+        <w:t xml:space="preserve">Figure </w:t>
+      </w:r>
+      <w:r>
+        <w:fldChar w:fldCharType="begin"/>
+      </w:r>
+      <w:r>
+        <w:instrText xml:space="preserve"> SEQ Figure \* ARABIC </w:instrText>
+      </w:r>
+      <w:r>
+        <w:fldChar w:fldCharType="separate"/>
+      </w:r>
+      <w:r>
+        <w:t>#</w:t>
+      </w:r>
+      <w:r>
+        <w:fldChar w:fldCharType="end"/>
+      </w:r>
+      <w:r>
+        <w:t>: MAG-IMG002x1-NC Production Test Flow</w:t>
       </w:r>
     </w:p>
     <w:p>
@@ -1443,15 +2582,28 @@
     </w:p>
     <w:p>
       <w:pPr>
-        <w:jc w:val="center"/>
+        <w:pStyle w:val="Caption"/>
       </w:pPr>
       <w:r>
-        <w:rPr>
-          <w:i/>
-          <w:color w:val="64748B"/>
-          <w:sz w:val="18"/>
-        </w:rPr>
-        <w:t>Figure 3: MAG-IMG002x1-NC Trim Test Flow</w:t>
+        <w:t xml:space="preserve">Figure </w:t>
+      </w:r>
+      <w:r>
+        <w:fldChar w:fldCharType="begin"/>
+      </w:r>
+      <w:r>
+        <w:instrText xml:space="preserve"> SEQ Figure \* ARABIC </w:instrText>
+      </w:r>
+      <w:r>
+        <w:fldChar w:fldCharType="separate"/>
+      </w:r>
+      <w:r>
+        <w:t>#</w:t>
+      </w:r>
+      <w:r>
+        <w:fldChar w:fldCharType="end"/>
+      </w:r>
+      <w:r>
+        <w:t>: MAG-IMG002x1-NC Trim Test Flow</w:t>
       </w:r>
     </w:p>
     <w:p>
@@ -1470,6 +2622,32 @@
           <w:sz w:val="22"/>
         </w:rPr>
         <w:t>The tables below define the temperature and supply voltage test conditions used across the IMG002x1 electrical and electro-optical test stages. Each test stage references a subset of these conditions (Min, Nom, and/or Max). The different supply domains are coupled, meaning that, for example, if the Max supply condition is chosen for a certain test stage, all supply domains will be set to their Max values. Cross-coupled settings such as Analog at Vnom and Digital at Vmax are not allowed.</w:t>
+      </w:r>
+    </w:p>
+    <w:p>
+      <w:pPr>
+        <w:pStyle w:val="Caption"/>
+      </w:pPr>
+      <w:r>
+        <w:t xml:space="preserve">Table </w:t>
+      </w:r>
+      <w:r>
+        <w:fldChar w:fldCharType="begin"/>
+      </w:r>
+      <w:r>
+        <w:instrText xml:space="preserve"> SEQ Table \* ARABIC </w:instrText>
+      </w:r>
+      <w:r>
+        <w:fldChar w:fldCharType="separate"/>
+      </w:r>
+      <w:r>
+        <w:t>#</w:t>
+      </w:r>
+      <w:r>
+        <w:fldChar w:fldCharType="end"/>
+      </w:r>
+      <w:r>
+        <w:t>: MAG-IMG002x1-NC Temperature Conditions</w:t>
       </w:r>
     </w:p>
     <w:tbl>
@@ -1673,6 +2851,32 @@
       </w:tr>
     </w:tbl>
     <w:p/>
+    <w:p>
+      <w:pPr>
+        <w:pStyle w:val="Caption"/>
+      </w:pPr>
+      <w:r>
+        <w:t xml:space="preserve">Table </w:t>
+      </w:r>
+      <w:r>
+        <w:fldChar w:fldCharType="begin"/>
+      </w:r>
+      <w:r>
+        <w:instrText xml:space="preserve"> SEQ Table \* ARABIC </w:instrText>
+      </w:r>
+      <w:r>
+        <w:fldChar w:fldCharType="separate"/>
+      </w:r>
+      <w:r>
+        <w:t>#</w:t>
+      </w:r>
+      <w:r>
+        <w:fldChar w:fldCharType="end"/>
+      </w:r>
+      <w:r>
+        <w:t>: MAG-IMG002x1-NC Supply Voltage Conditions</w:t>
+      </w:r>
+    </w:p>
     <w:tbl>
       <w:tblPr>
         <w:tblStyle w:val="GridTable4-Accent3"/>
@@ -2291,6 +3495,32 @@
           <w:sz w:val="22"/>
         </w:rPr>
         <w:t>The table below lists all test procedures applicable to the MAG-IMG002x1-NC and indicates in which test stage each procedure is executed. The FT stage provides full electrical parametric coverage, while TRIM focuses on calibrating internal references. The OT stage validates optical performance under controlled illumination. The Conditions column notes any deviation from the default test conditions for that test stage, an empty cell means the default conditions listed under Test stages section applies.</w:t>
+      </w:r>
+    </w:p>
+    <w:p>
+      <w:pPr>
+        <w:pStyle w:val="Caption"/>
+      </w:pPr>
+      <w:r>
+        <w:t xml:space="preserve">Table </w:t>
+      </w:r>
+      <w:r>
+        <w:fldChar w:fldCharType="begin"/>
+      </w:r>
+      <w:r>
+        <w:instrText xml:space="preserve"> SEQ Table \* ARABIC </w:instrText>
+      </w:r>
+      <w:r>
+        <w:fldChar w:fldCharType="separate"/>
+      </w:r>
+      <w:r>
+        <w:t>#</w:t>
+      </w:r>
+      <w:r>
+        <w:fldChar w:fldCharType="end"/>
+      </w:r>
+      <w:r>
+        <w:t>: MAG-IMG002x1-NC Test Procedures</w:t>
       </w:r>
     </w:p>
     <w:tbl>
@@ -4731,18 +5961,6 @@
     </w:tbl>
     <w:p/>
     <w:p>
-      <w:pPr>
-        <w:jc w:val="center"/>
-      </w:pPr>
-      <w:r>
-        <w:rPr>
-          <w:i/>
-          <w:sz w:val="18"/>
-        </w:rPr>
-        <w:t>*Parameter traceability: MAG-IMG002X1-NC*</w:t>
-      </w:r>
-    </w:p>
-    <w:p>
       <w:r>
         <w:rPr>
           <w:rFonts w:ascii="Calibri" w:hAnsi="Calibri"/>
@@ -4750,6 +5968,32 @@
           <w:sz w:val="22"/>
         </w:rPr>
         <w:t>The table below maps each test procedure to the datasheet parameters it verifies. Parameters are listed by their Chapter 7 name. Note that only a subset of the test procedures is used to cover all datasheet parameters.</w:t>
+      </w:r>
+    </w:p>
+    <w:p>
+      <w:pPr>
+        <w:pStyle w:val="Caption"/>
+      </w:pPr>
+      <w:r>
+        <w:t xml:space="preserve">Table </w:t>
+      </w:r>
+      <w:r>
+        <w:fldChar w:fldCharType="begin"/>
+      </w:r>
+      <w:r>
+        <w:instrText xml:space="preserve"> SEQ Table \* ARABIC </w:instrText>
+      </w:r>
+      <w:r>
+        <w:fldChar w:fldCharType="separate"/>
+      </w:r>
+      <w:r>
+        <w:t>#</w:t>
+      </w:r>
+      <w:r>
+        <w:fldChar w:fldCharType="end"/>
+      </w:r>
+      <w:r>
+        <w:t>: MAG-IMG002x1-NC Parameter Traceability</w:t>
       </w:r>
     </w:p>
     <w:tbl>
@@ -5085,7 +6329,7 @@
         <w:pStyle w:val="Heading3"/>
       </w:pPr>
       <w:r>
-        <w:t>6.1.2 MAG-CXP00002-NP (CXP Interface IC)</w:t>
+        <w:t>MAG-CXP00002-NP (CXP Interface IC)</w:t>
       </w:r>
     </w:p>
     <w:p>
@@ -5147,15 +6391,28 @@
     </w:p>
     <w:p>
       <w:pPr>
-        <w:jc w:val="center"/>
+        <w:pStyle w:val="Caption"/>
       </w:pPr>
       <w:r>
-        <w:rPr>
-          <w:i/>
-          <w:color w:val="64748B"/>
-          <w:sz w:val="18"/>
-        </w:rPr>
-        <w:t>Figure 4: MAG-CXP00002-NP Production Test Flow</w:t>
+        <w:t xml:space="preserve">Figure </w:t>
+      </w:r>
+      <w:r>
+        <w:fldChar w:fldCharType="begin"/>
+      </w:r>
+      <w:r>
+        <w:instrText xml:space="preserve"> SEQ Figure \* ARABIC </w:instrText>
+      </w:r>
+      <w:r>
+        <w:fldChar w:fldCharType="separate"/>
+      </w:r>
+      <w:r>
+        <w:t>#</w:t>
+      </w:r>
+      <w:r>
+        <w:fldChar w:fldCharType="end"/>
+      </w:r>
+      <w:r>
+        <w:t>: MAG-CXP00002-NP Production Test Flow</w:t>
       </w:r>
     </w:p>
     <w:p>
@@ -5174,6 +6431,32 @@
           <w:sz w:val="22"/>
         </w:rPr>
         <w:t>The tables below define the temperature and supply voltage test conditions used across the CXP00002 test stages. Each test stage references a subset of these conditions (Min, Nom, and/or Max). The CXP00002 has a single 3.3 V supply level that is shared over all the domains (Digital, PLL and Analog).</w:t>
+      </w:r>
+    </w:p>
+    <w:p>
+      <w:pPr>
+        <w:pStyle w:val="Caption"/>
+      </w:pPr>
+      <w:r>
+        <w:t xml:space="preserve">Table </w:t>
+      </w:r>
+      <w:r>
+        <w:fldChar w:fldCharType="begin"/>
+      </w:r>
+      <w:r>
+        <w:instrText xml:space="preserve"> SEQ Table \* ARABIC </w:instrText>
+      </w:r>
+      <w:r>
+        <w:fldChar w:fldCharType="separate"/>
+      </w:r>
+      <w:r>
+        <w:t>#</w:t>
+      </w:r>
+      <w:r>
+        <w:fldChar w:fldCharType="end"/>
+      </w:r>
+      <w:r>
+        <w:t>: MAG-CXP00002-NP Temperature Conditions</w:t>
       </w:r>
     </w:p>
     <w:tbl>
@@ -5377,6 +6660,32 @@
       </w:tr>
     </w:tbl>
     <w:p/>
+    <w:p>
+      <w:pPr>
+        <w:pStyle w:val="Caption"/>
+      </w:pPr>
+      <w:r>
+        <w:t xml:space="preserve">Table </w:t>
+      </w:r>
+      <w:r>
+        <w:fldChar w:fldCharType="begin"/>
+      </w:r>
+      <w:r>
+        <w:instrText xml:space="preserve"> SEQ Table \* ARABIC </w:instrText>
+      </w:r>
+      <w:r>
+        <w:fldChar w:fldCharType="separate"/>
+      </w:r>
+      <w:r>
+        <w:t>#</w:t>
+      </w:r>
+      <w:r>
+        <w:fldChar w:fldCharType="end"/>
+      </w:r>
+      <w:r>
+        <w:t>: MAG-CXP00002-NP Supply Voltage Conditions</w:t>
+      </w:r>
+    </w:p>
     <w:tbl>
       <w:tblPr>
         <w:tblStyle w:val="GridTable4-Accent3"/>
@@ -5674,6 +6983,32 @@
           <w:sz w:val="22"/>
         </w:rPr>
         <w:t>The table below lists all test procedures applicable to the MAG-CXP00002-NP and indicates in which test stage each procedure is executed. The TRIM stage calibrates internal LDOs and references and programs the OTP memory, after which the FT stage verifies the full parametric and functional performance of the serializer, including its high-speed CXP interface and SPI communication channels. The Conditions column notes any deviation from the default test conditions for that test stage, an empty cell means the default conditions listed under Test stages section applies.</w:t>
+      </w:r>
+    </w:p>
+    <w:p>
+      <w:pPr>
+        <w:pStyle w:val="Caption"/>
+      </w:pPr>
+      <w:r>
+        <w:t xml:space="preserve">Table </w:t>
+      </w:r>
+      <w:r>
+        <w:fldChar w:fldCharType="begin"/>
+      </w:r>
+      <w:r>
+        <w:instrText xml:space="preserve"> SEQ Table \* ARABIC </w:instrText>
+      </w:r>
+      <w:r>
+        <w:fldChar w:fldCharType="separate"/>
+      </w:r>
+      <w:r>
+        <w:t>#</w:t>
+      </w:r>
+      <w:r>
+        <w:fldChar w:fldCharType="end"/>
+      </w:r>
+      <w:r>
+        <w:t>: MAG-CXP00002-NP Test Procedures</w:t>
       </w:r>
     </w:p>
     <w:tbl>
@@ -7466,18 +8801,6 @@
     </w:tbl>
     <w:p/>
     <w:p>
-      <w:pPr>
-        <w:jc w:val="center"/>
-      </w:pPr>
-      <w:r>
-        <w:rPr>
-          <w:i/>
-          <w:sz w:val="18"/>
-        </w:rPr>
-        <w:t>*Parameter traceability: MAG-CXP00002-NP*</w:t>
-      </w:r>
-    </w:p>
-    <w:p>
       <w:r>
         <w:rPr>
           <w:rFonts w:ascii="Calibri" w:hAnsi="Calibri"/>
@@ -7485,6 +8808,32 @@
           <w:sz w:val="22"/>
         </w:rPr>
         <w:t>The table below maps each test procedure to the datasheet parameters it verifies. Parameters are listed by their Chapter 7 name. Note that only a subset of the test procedures is used to cover all datasheet parameters.</w:t>
+      </w:r>
+    </w:p>
+    <w:p>
+      <w:pPr>
+        <w:pStyle w:val="Caption"/>
+      </w:pPr>
+      <w:r>
+        <w:t xml:space="preserve">Table </w:t>
+      </w:r>
+      <w:r>
+        <w:fldChar w:fldCharType="begin"/>
+      </w:r>
+      <w:r>
+        <w:instrText xml:space="preserve"> SEQ Table \* ARABIC </w:instrText>
+      </w:r>
+      <w:r>
+        <w:fldChar w:fldCharType="separate"/>
+      </w:r>
+      <w:r>
+        <w:t>#</w:t>
+      </w:r>
+      <w:r>
+        <w:fldChar w:fldCharType="end"/>
+      </w:r>
+      <w:r>
+        <w:t>: MAG-CXP00002-NP Parameter Traceability</w:t>
       </w:r>
     </w:p>
     <w:tbl>
@@ -7820,7 +9169,7 @@
         <w:pStyle w:val="Heading3"/>
       </w:pPr>
       <w:r>
-        <w:t>6.1.3 MAG-PSU00001-NP (Power Management IC)</w:t>
+        <w:t>MAG-PSU00001-NP (Power Management IC)</w:t>
       </w:r>
     </w:p>
     <w:p>
@@ -7882,15 +9231,28 @@
     </w:p>
     <w:p>
       <w:pPr>
-        <w:jc w:val="center"/>
+        <w:pStyle w:val="Caption"/>
       </w:pPr>
       <w:r>
-        <w:rPr>
-          <w:i/>
-          <w:color w:val="64748B"/>
-          <w:sz w:val="18"/>
-        </w:rPr>
-        <w:t>Figure 5: MAG-PSU00001-NP Production Test Flow</w:t>
+        <w:t xml:space="preserve">Figure </w:t>
+      </w:r>
+      <w:r>
+        <w:fldChar w:fldCharType="begin"/>
+      </w:r>
+      <w:r>
+        <w:instrText xml:space="preserve"> SEQ Figure \* ARABIC </w:instrText>
+      </w:r>
+      <w:r>
+        <w:fldChar w:fldCharType="separate"/>
+      </w:r>
+      <w:r>
+        <w:t>#</w:t>
+      </w:r>
+      <w:r>
+        <w:fldChar w:fldCharType="end"/>
+      </w:r>
+      <w:r>
+        <w:t>: MAG-PSU00001-NP Production Test Flow</w:t>
       </w:r>
     </w:p>
     <w:p>
@@ -7909,6 +9271,32 @@
           <w:sz w:val="22"/>
         </w:rPr>
         <w:t>The tables below define the temperature and input voltage test conditions used across the PSU00001 test stages. Each test stage references a subset of these conditions (Min, Nom, and/or Max). The PSU00001 is a DC/DC converter with a single input voltage domain.</w:t>
+      </w:r>
+    </w:p>
+    <w:p>
+      <w:pPr>
+        <w:pStyle w:val="Caption"/>
+      </w:pPr>
+      <w:r>
+        <w:t xml:space="preserve">Table </w:t>
+      </w:r>
+      <w:r>
+        <w:fldChar w:fldCharType="begin"/>
+      </w:r>
+      <w:r>
+        <w:instrText xml:space="preserve"> SEQ Table \* ARABIC </w:instrText>
+      </w:r>
+      <w:r>
+        <w:fldChar w:fldCharType="separate"/>
+      </w:r>
+      <w:r>
+        <w:t>#</w:t>
+      </w:r>
+      <w:r>
+        <w:fldChar w:fldCharType="end"/>
+      </w:r>
+      <w:r>
+        <w:t>: MAG-PSU00001-NP Temperature Conditions</w:t>
       </w:r>
     </w:p>
     <w:tbl>
@@ -8112,6 +9500,32 @@
       </w:tr>
     </w:tbl>
     <w:p/>
+    <w:p>
+      <w:pPr>
+        <w:pStyle w:val="Caption"/>
+      </w:pPr>
+      <w:r>
+        <w:t xml:space="preserve">Table </w:t>
+      </w:r>
+      <w:r>
+        <w:fldChar w:fldCharType="begin"/>
+      </w:r>
+      <w:r>
+        <w:instrText xml:space="preserve"> SEQ Table \* ARABIC </w:instrText>
+      </w:r>
+      <w:r>
+        <w:fldChar w:fldCharType="separate"/>
+      </w:r>
+      <w:r>
+        <w:t>#</w:t>
+      </w:r>
+      <w:r>
+        <w:fldChar w:fldCharType="end"/>
+      </w:r>
+      <w:r>
+        <w:t>: MAG-PSU00001-NP Input Voltage Conditions</w:t>
+      </w:r>
+    </w:p>
     <w:tbl>
       <w:tblPr>
         <w:tblStyle w:val="GridTable4-Accent3"/>
@@ -8399,6 +9813,32 @@
           <w:sz w:val="22"/>
         </w:rPr>
         <w:t>The table below lists all test procedures applicable to the MAG-PSU00001-NP. The PSU00001 does not include trimming or NVM programming. The CONN connectivity check is performed as a gate before the FT procedures listed here. The Conditions column notes any deviation from the default test conditions for that test stage, an empty cell means the default conditions listed under Test stages section applies.</w:t>
+      </w:r>
+    </w:p>
+    <w:p>
+      <w:pPr>
+        <w:pStyle w:val="Caption"/>
+      </w:pPr>
+      <w:r>
+        <w:t xml:space="preserve">Table </w:t>
+      </w:r>
+      <w:r>
+        <w:fldChar w:fldCharType="begin"/>
+      </w:r>
+      <w:r>
+        <w:instrText xml:space="preserve"> SEQ Table \* ARABIC </w:instrText>
+      </w:r>
+      <w:r>
+        <w:fldChar w:fldCharType="separate"/>
+      </w:r>
+      <w:r>
+        <w:t>#</w:t>
+      </w:r>
+      <w:r>
+        <w:fldChar w:fldCharType="end"/>
+      </w:r>
+      <w:r>
+        <w:t>: MAG-PSU00001-NP Test Procedures</w:t>
       </w:r>
     </w:p>
     <w:tbl>
@@ -9576,18 +11016,6 @@
     </w:tbl>
     <w:p/>
     <w:p>
-      <w:pPr>
-        <w:jc w:val="center"/>
-      </w:pPr>
-      <w:r>
-        <w:rPr>
-          <w:i/>
-          <w:sz w:val="18"/>
-        </w:rPr>
-        <w:t>*Parameter traceability: MAG-PSU00001-NP*</w:t>
-      </w:r>
-    </w:p>
-    <w:p>
       <w:r>
         <w:rPr>
           <w:rFonts w:ascii="Calibri" w:hAnsi="Calibri"/>
@@ -9595,6 +11023,32 @@
           <w:sz w:val="22"/>
         </w:rPr>
         <w:t>The table below maps each test procedure to the datasheet parameters it verifies. Parameters are listed by their Chapter 7 name. Note that only a subset of the test procedures is used to cover all datasheet parameters.</w:t>
+      </w:r>
+    </w:p>
+    <w:p>
+      <w:pPr>
+        <w:pStyle w:val="Caption"/>
+      </w:pPr>
+      <w:r>
+        <w:t xml:space="preserve">Table </w:t>
+      </w:r>
+      <w:r>
+        <w:fldChar w:fldCharType="begin"/>
+      </w:r>
+      <w:r>
+        <w:instrText xml:space="preserve"> SEQ Table \* ARABIC </w:instrText>
+      </w:r>
+      <w:r>
+        <w:fldChar w:fldCharType="separate"/>
+      </w:r>
+      <w:r>
+        <w:t>#</w:t>
+      </w:r>
+      <w:r>
+        <w:fldChar w:fldCharType="end"/>
+      </w:r>
+      <w:r>
+        <w:t>: MAG-PSU00001-NP Parameter Traceability</w:t>
       </w:r>
     </w:p>
     <w:tbl>
@@ -9842,7 +11296,7 @@
         <w:pStyle w:val="Heading2"/>
       </w:pPr>
       <w:r>
-        <w:t>6.2 Level 2: PCB Test Specifications</w:t>
+        <w:t>Level 2: PCB Test Specifications</w:t>
       </w:r>
     </w:p>
     <w:p>
@@ -9860,7 +11314,7 @@
         <w:pStyle w:val="Heading3"/>
       </w:pPr>
       <w:r>
-        <w:t>6.2.1 Test flows</w:t>
+        <w:t>Test flows</w:t>
       </w:r>
     </w:p>
     <w:p>
@@ -9932,15 +11386,28 @@
     </w:p>
     <w:p>
       <w:pPr>
-        <w:jc w:val="center"/>
+        <w:pStyle w:val="Caption"/>
       </w:pPr>
       <w:r>
-        <w:rPr>
-          <w:i/>
-          <w:color w:val="64748B"/>
-          <w:sz w:val="18"/>
-        </w:rPr>
-        <w:t>Figure 6: MAG-VIS4000x-N Production Test Flow</w:t>
+        <w:t xml:space="preserve">Figure </w:t>
+      </w:r>
+      <w:r>
+        <w:fldChar w:fldCharType="begin"/>
+      </w:r>
+      <w:r>
+        <w:instrText xml:space="preserve"> SEQ Figure \* ARABIC </w:instrText>
+      </w:r>
+      <w:r>
+        <w:fldChar w:fldCharType="separate"/>
+      </w:r>
+      <w:r>
+        <w:t>#</w:t>
+      </w:r>
+      <w:r>
+        <w:fldChar w:fldCharType="end"/>
+      </w:r>
+      <w:r>
+        <w:t>: MAG-VIS4000x-N Production Test Flow</w:t>
       </w:r>
     </w:p>
     <w:p>
@@ -10002,15 +11469,28 @@
     </w:p>
     <w:p>
       <w:pPr>
-        <w:jc w:val="center"/>
+        <w:pStyle w:val="Caption"/>
       </w:pPr>
       <w:r>
-        <w:rPr>
-          <w:i/>
-          <w:color w:val="64748B"/>
-          <w:sz w:val="18"/>
-        </w:rPr>
-        <w:t>Figure 7: MAG-VIS4003x-N Production Test Flow</w:t>
+        <w:t xml:space="preserve">Figure </w:t>
+      </w:r>
+      <w:r>
+        <w:fldChar w:fldCharType="begin"/>
+      </w:r>
+      <w:r>
+        <w:instrText xml:space="preserve"> SEQ Figure \* ARABIC </w:instrText>
+      </w:r>
+      <w:r>
+        <w:fldChar w:fldCharType="separate"/>
+      </w:r>
+      <w:r>
+        <w:t>#</w:t>
+      </w:r>
+      <w:r>
+        <w:fldChar w:fldCharType="end"/>
+      </w:r>
+      <w:r>
+        <w:t>: MAG-VIS4003x-N Production Test Flow</w:t>
       </w:r>
     </w:p>
     <w:p>
@@ -10072,15 +11552,28 @@
     </w:p>
     <w:p>
       <w:pPr>
-        <w:jc w:val="center"/>
+        <w:pStyle w:val="Caption"/>
       </w:pPr>
       <w:r>
-        <w:rPr>
-          <w:i/>
-          <w:color w:val="64748B"/>
-          <w:sz w:val="18"/>
-        </w:rPr>
-        <w:t>Figure 8: MAG-VIS4001x-N Production Test Flow</w:t>
+        <w:t xml:space="preserve">Figure </w:t>
+      </w:r>
+      <w:r>
+        <w:fldChar w:fldCharType="begin"/>
+      </w:r>
+      <w:r>
+        <w:instrText xml:space="preserve"> SEQ Figure \* ARABIC </w:instrText>
+      </w:r>
+      <w:r>
+        <w:fldChar w:fldCharType="separate"/>
+      </w:r>
+      <w:r>
+        <w:t>#</w:t>
+      </w:r>
+      <w:r>
+        <w:fldChar w:fldCharType="end"/>
+      </w:r>
+      <w:r>
+        <w:t>: MAG-VIS4001x-N Production Test Flow</w:t>
       </w:r>
     </w:p>
     <w:p>
@@ -10088,7 +11581,7 @@
         <w:pStyle w:val="Heading3"/>
       </w:pPr>
       <w:r>
-        <w:t>6.2.2 Test conditions</w:t>
+        <w:t>Test conditions</w:t>
       </w:r>
     </w:p>
     <w:p>
@@ -10098,7 +11591,7 @@
           <w:b w:val="0"/>
           <w:sz w:val="22"/>
         </w:rPr>
-        <w:t>Since the PCB-level tests are functional verification tests rather than parametric characterisation, all procedures are executed at ambient temperature and nominal supply voltage only. No temperature or supply corner sweeps are applied at this level; the underlying IC components have already been fully characterised at level 1.</w:t>
+        <w:t>Since the PCB-level tests are functional verification tests rather than parametric characterisation, all procedures are executed at ambient temperature and nominal supply voltage only. No temperature or supply corner conditions are applied at this level, the underlying IC components have already been fully tested at level 1.</w:t>
       </w:r>
     </w:p>
     <w:p>
@@ -10132,7 +11625,7 @@
         <w:pStyle w:val="Heading3"/>
       </w:pPr>
       <w:r>
-        <w:t>6.2.3 Test stages</w:t>
+        <w:t>Test stages</w:t>
       </w:r>
     </w:p>
     <w:p>
@@ -10142,23 +11635,7 @@
           <w:b w:val="0"/>
           <w:sz w:val="22"/>
         </w:rPr>
-        <w:t xml:space="preserve">All three PCBs share the </w:t>
-      </w:r>
-      <w:r>
-        <w:rPr>
-          <w:rFonts w:ascii="Calibri" w:hAnsi="Calibri"/>
-          <w:b/>
-          <w:sz w:val="22"/>
-        </w:rPr>
-        <w:t>VIS (Vision Test)</w:t>
-      </w:r>
-      <w:r>
-        <w:rPr>
-          <w:rFonts w:ascii="Calibri" w:hAnsi="Calibri"/>
-          <w:b w:val="0"/>
-          <w:sz w:val="22"/>
-        </w:rPr>
-        <w:t xml:space="preserve"> test stage as their primary functional verification. The Power PCB additionally includes a </w:t>
+        <w:t xml:space="preserve">All three PCBs share the VIS test stage as their primary functional verification. The Power PCB additionally includes a </w:t>
       </w:r>
       <w:r>
         <w:rPr>
@@ -10266,7 +11743,7 @@
         <w:pStyle w:val="Heading3"/>
       </w:pPr>
       <w:r>
-        <w:t>6.2.4 Test procedures</w:t>
+        <w:t>Test procedures</w:t>
       </w:r>
     </w:p>
     <w:p>
@@ -10281,14 +11758,28 @@
     </w:p>
     <w:p>
       <w:pPr>
-        <w:jc w:val="center"/>
+        <w:pStyle w:val="Caption"/>
       </w:pPr>
       <w:r>
-        <w:rPr>
-          <w:i/>
-          <w:sz w:val="18"/>
-        </w:rPr>
-        <w:t>*MAG-VIS4000x-N (Imager PCB) -- VIS test stage:*</w:t>
+        <w:t xml:space="preserve">Table </w:t>
+      </w:r>
+      <w:r>
+        <w:fldChar w:fldCharType="begin"/>
+      </w:r>
+      <w:r>
+        <w:instrText xml:space="preserve"> SEQ Table \* ARABIC </w:instrText>
+      </w:r>
+      <w:r>
+        <w:fldChar w:fldCharType="separate"/>
+      </w:r>
+      <w:r>
+        <w:t>#</w:t>
+      </w:r>
+      <w:r>
+        <w:fldChar w:fldCharType="end"/>
+      </w:r>
+      <w:r>
+        <w:t>: MAG-VIS4000x-N VIS Test Procedures</w:t>
       </w:r>
     </w:p>
     <w:tbl>
@@ -10432,14 +11923,28 @@
     <w:p/>
     <w:p>
       <w:pPr>
-        <w:jc w:val="center"/>
+        <w:pStyle w:val="Caption"/>
       </w:pPr>
       <w:r>
-        <w:rPr>
-          <w:i/>
-          <w:sz w:val="18"/>
-        </w:rPr>
-        <w:t>*MAG-VIS4003x-N (Serializer PCB) -- VIS test stage:*</w:t>
+        <w:t xml:space="preserve">Table </w:t>
+      </w:r>
+      <w:r>
+        <w:fldChar w:fldCharType="begin"/>
+      </w:r>
+      <w:r>
+        <w:instrText xml:space="preserve"> SEQ Table \* ARABIC </w:instrText>
+      </w:r>
+      <w:r>
+        <w:fldChar w:fldCharType="separate"/>
+      </w:r>
+      <w:r>
+        <w:t>#</w:t>
+      </w:r>
+      <w:r>
+        <w:fldChar w:fldCharType="end"/>
+      </w:r>
+      <w:r>
+        <w:t>: MAG-VIS4003x-N VIS Test Procedures</w:t>
       </w:r>
     </w:p>
     <w:tbl>
@@ -10673,14 +12178,28 @@
     <w:p/>
     <w:p>
       <w:pPr>
-        <w:jc w:val="center"/>
+        <w:pStyle w:val="Caption"/>
       </w:pPr>
       <w:r>
-        <w:rPr>
-          <w:i/>
-          <w:sz w:val="18"/>
-        </w:rPr>
-        <w:t>*MAG-VIS4001x-N (Power PCB) -- CONN + VIS test stages:*</w:t>
+        <w:t xml:space="preserve">Table </w:t>
+      </w:r>
+      <w:r>
+        <w:fldChar w:fldCharType="begin"/>
+      </w:r>
+      <w:r>
+        <w:instrText xml:space="preserve"> SEQ Table \* ARABIC </w:instrText>
+      </w:r>
+      <w:r>
+        <w:fldChar w:fldCharType="separate"/>
+      </w:r>
+      <w:r>
+        <w:t>#</w:t>
+      </w:r>
+      <w:r>
+        <w:fldChar w:fldCharType="end"/>
+      </w:r>
+      <w:r>
+        <w:t>: MAG-VIS4001x-N CONN + VIS Test Procedures</w:t>
       </w:r>
     </w:p>
     <w:tbl>
@@ -10917,7 +12436,7 @@
         <w:pStyle w:val="Heading2"/>
       </w:pPr>
       <w:r>
-        <w:t>6.3 Level 3: Module Test Specifications</w:t>
+        <w:t>Level 3: Module Test Specifications</w:t>
       </w:r>
     </w:p>
     <w:p>
@@ -10947,7 +12466,7 @@
         <w:pStyle w:val="Heading3"/>
       </w:pPr>
       <w:r>
-        <w:t>6.3.1 Test flow</w:t>
+        <w:t>Test flow</w:t>
       </w:r>
     </w:p>
     <w:p>
@@ -11001,15 +12520,28 @@
     </w:p>
     <w:p>
       <w:pPr>
-        <w:jc w:val="center"/>
+        <w:pStyle w:val="Caption"/>
       </w:pPr>
       <w:r>
-        <w:rPr>
-          <w:i/>
-          <w:color w:val="64748B"/>
-          <w:sz w:val="18"/>
-        </w:rPr>
-        <w:t>Figure 9: MAG-VIS100xx-N Production Test Flow</w:t>
+        <w:t xml:space="preserve">Figure </w:t>
+      </w:r>
+      <w:r>
+        <w:fldChar w:fldCharType="begin"/>
+      </w:r>
+      <w:r>
+        <w:instrText xml:space="preserve"> SEQ Figure \* ARABIC </w:instrText>
+      </w:r>
+      <w:r>
+        <w:fldChar w:fldCharType="separate"/>
+      </w:r>
+      <w:r>
+        <w:t>#</w:t>
+      </w:r>
+      <w:r>
+        <w:fldChar w:fldCharType="end"/>
+      </w:r>
+      <w:r>
+        <w:t>: MAG-VIS100xx-N Production Test Flow</w:t>
       </w:r>
     </w:p>
     <w:p>
@@ -11017,7 +12549,7 @@
         <w:pStyle w:val="Heading3"/>
       </w:pPr>
       <w:r>
-        <w:t>6.3.2 Test conditions</w:t>
+        <w:t>Test conditions</w:t>
       </w:r>
     </w:p>
     <w:p>
@@ -11028,6 +12560,32 @@
           <w:sz w:val="22"/>
         </w:rPr>
         <w:t>The tables below define the temperature, supply voltage, and imager mode test conditions used for the module-level verification. Each test procedure references a subset of these conditions.</w:t>
+      </w:r>
+    </w:p>
+    <w:p>
+      <w:pPr>
+        <w:pStyle w:val="Caption"/>
+      </w:pPr>
+      <w:r>
+        <w:t xml:space="preserve">Table </w:t>
+      </w:r>
+      <w:r>
+        <w:fldChar w:fldCharType="begin"/>
+      </w:r>
+      <w:r>
+        <w:instrText xml:space="preserve"> SEQ Table \* ARABIC </w:instrText>
+      </w:r>
+      <w:r>
+        <w:fldChar w:fldCharType="separate"/>
+      </w:r>
+      <w:r>
+        <w:t>#</w:t>
+      </w:r>
+      <w:r>
+        <w:fldChar w:fldCharType="end"/>
+      </w:r>
+      <w:r>
+        <w:t>: MAG-VIS100xx-N Temperature Conditions</w:t>
       </w:r>
     </w:p>
     <w:tbl>
@@ -11231,6 +12789,32 @@
       </w:tr>
     </w:tbl>
     <w:p/>
+    <w:p>
+      <w:pPr>
+        <w:pStyle w:val="Caption"/>
+      </w:pPr>
+      <w:r>
+        <w:t xml:space="preserve">Table </w:t>
+      </w:r>
+      <w:r>
+        <w:fldChar w:fldCharType="begin"/>
+      </w:r>
+      <w:r>
+        <w:instrText xml:space="preserve"> SEQ Table \* ARABIC </w:instrText>
+      </w:r>
+      <w:r>
+        <w:fldChar w:fldCharType="separate"/>
+      </w:r>
+      <w:r>
+        <w:t>#</w:t>
+      </w:r>
+      <w:r>
+        <w:fldChar w:fldCharType="end"/>
+      </w:r>
+      <w:r>
+        <w:t>: MAG-VIS100xx-N Supply Voltage Conditions</w:t>
+      </w:r>
+    </w:p>
     <w:tbl>
       <w:tblPr>
         <w:tblStyle w:val="GridTable4-Accent3"/>
@@ -11432,6 +13016,32 @@
       </w:tr>
     </w:tbl>
     <w:p/>
+    <w:p>
+      <w:pPr>
+        <w:pStyle w:val="Caption"/>
+      </w:pPr>
+      <w:r>
+        <w:t xml:space="preserve">Table </w:t>
+      </w:r>
+      <w:r>
+        <w:fldChar w:fldCharType="begin"/>
+      </w:r>
+      <w:r>
+        <w:instrText xml:space="preserve"> SEQ Table \* ARABIC </w:instrText>
+      </w:r>
+      <w:r>
+        <w:fldChar w:fldCharType="separate"/>
+      </w:r>
+      <w:r>
+        <w:t>#</w:t>
+      </w:r>
+      <w:r>
+        <w:fldChar w:fldCharType="end"/>
+      </w:r>
+      <w:r>
+        <w:t>: MAG-VIS100xx-N Imager Mode Conditions</w:t>
+      </w:r>
+    </w:p>
     <w:tbl>
       <w:tblPr>
         <w:tblStyle w:val="GridTable4-Accent3"/>
@@ -11702,7 +13312,7 @@
         <w:pStyle w:val="Heading3"/>
       </w:pPr>
       <w:r>
-        <w:t>6.3.3 Test stages</w:t>
+        <w:t>Test stages</w:t>
       </w:r>
     </w:p>
     <w:p>
@@ -11733,7 +13343,7 @@
           <w:b w:val="0"/>
           <w:sz w:val="22"/>
         </w:rPr>
-        <w:t xml:space="preserve"> Assessment of the physical condition of the assembled module to identify visible defects before electrical testing. Checks for cracks, pin issues, delamination, solder anomalies, or mechanical damage on the integrated stack.</w:t>
+        <w:t xml:space="preserve"> Assessment of the physical condition of the assembled module to identify visible defects before electrical testing. Checks for cracks, pin issues, solder anomalies, or mechanical damage on the integrated stack.</w:t>
       </w:r>
     </w:p>
     <w:p>
@@ -11762,7 +13372,7 @@
         <w:pStyle w:val="Heading3"/>
       </w:pPr>
       <w:r>
-        <w:t>6.3.4 Test procedures</w:t>
+        <w:t>Test procedures</w:t>
       </w:r>
     </w:p>
     <w:p>
@@ -11773,6 +13383,32 @@
           <w:sz w:val="22"/>
         </w:rPr>
         <w:t>The table below lists all test procedures for the integrated module. The VI stage is a manual inspection performed before any electrical test. The VER stage validates the complete signal chain -- from power delivery through image capture to CXP serialization -- at full operational speed. Module variants that include the MAG-DRV IC have additional driver-specific tests.</w:t>
+      </w:r>
+    </w:p>
+    <w:p>
+      <w:pPr>
+        <w:pStyle w:val="Caption"/>
+      </w:pPr>
+      <w:r>
+        <w:t xml:space="preserve">Table </w:t>
+      </w:r>
+      <w:r>
+        <w:fldChar w:fldCharType="begin"/>
+      </w:r>
+      <w:r>
+        <w:instrText xml:space="preserve"> SEQ Table \* ARABIC </w:instrText>
+      </w:r>
+      <w:r>
+        <w:fldChar w:fldCharType="separate"/>
+      </w:r>
+      <w:r>
+        <w:t>#</w:t>
+      </w:r>
+      <w:r>
+        <w:fldChar w:fldCharType="end"/>
+      </w:r>
+      <w:r>
+        <w:t>: MAG-VIS100xx-N Module Test Procedures</w:t>
       </w:r>
     </w:p>
     <w:tbl>
@@ -12188,7 +13824,7 @@
                 <w:rFonts w:ascii="Calibri" w:hAnsi="Calibri"/>
                 <w:sz w:val="20"/>
               </w:rPr>
-              <w:t>MAG-DRV Capabilities (MAG-VIS1000x only)</w:t>
+              <w:t>MAG-DRV Capabilities (MAG-VIS1001x only)</w:t>
             </w:r>
           </w:p>
         </w:tc>
@@ -12311,7 +13947,7 @@
         <w:pStyle w:val="Heading1"/>
       </w:pPr>
       <w:r>
-        <w:t>7. Product Specifications &amp; Acceptance Criteria</w:t>
+        <w:t>Product Specifications &amp; Acceptance Criteria</w:t>
       </w:r>
     </w:p>
     <w:p>
@@ -12321,7 +13957,7 @@
           <w:b w:val="0"/>
           <w:sz w:val="22"/>
         </w:rPr>
-        <w:t>The key specifications for the Vision Series products are extracted from their respective datasheets. The acceptance criteria and test limits are defined in the production test plans. Each measured parameter carries a unique Mxxxx identifier that links the datasheet specification to the corresponding entry in the check_limits production test database. The Mxxxx namespace is unique per product (i.e. M0016 in the CXP product is a different parameter than M0016 in the PSU product). Parameters that are validated functionally (pass/fail) or guaranteed by design do not carry an Mxxxx identifier.</w:t>
+        <w:t>The key specifications for the Vision Series products are extracted from their respective datasheets and are listed in this chapter. The acceptance criteria and test limits are defined in the production test plans and where extracted from the test system of the product.</w:t>
       </w:r>
     </w:p>
     <w:p>
@@ -12329,19 +13965,33 @@
         <w:pStyle w:val="Heading2"/>
       </w:pPr>
       <w:r>
-        <w:t>7.1 MAG-IMG002X1-NC (Full HD CMOS Image Sensor)</w:t>
+        <w:t>MAG-IMG002X1-NC (Full HD CMOS Image Sensor)</w:t>
       </w:r>
     </w:p>
     <w:p>
       <w:pPr>
-        <w:jc w:val="center"/>
+        <w:pStyle w:val="Caption"/>
       </w:pPr>
       <w:r>
-        <w:rPr>
-          <w:i/>
-          <w:sz w:val="18"/>
-        </w:rPr>
-        <w:t>*Table 1: MAG-IMG002X1-NC Key Specifications*</w:t>
+        <w:t xml:space="preserve">Table </w:t>
+      </w:r>
+      <w:r>
+        <w:fldChar w:fldCharType="begin"/>
+      </w:r>
+      <w:r>
+        <w:instrText xml:space="preserve"> SEQ Table \* ARABIC </w:instrText>
+      </w:r>
+      <w:r>
+        <w:fldChar w:fldCharType="separate"/>
+      </w:r>
+      <w:r>
+        <w:t>#</w:t>
+      </w:r>
+      <w:r>
+        <w:fldChar w:fldCharType="end"/>
+      </w:r>
+      <w:r>
+        <w:t>: MAG-IMG002X1-NC Key Specifications</w:t>
       </w:r>
     </w:p>
     <w:tbl>
@@ -17250,14 +18900,28 @@
     </w:p>
     <w:p>
       <w:pPr>
-        <w:jc w:val="center"/>
+        <w:pStyle w:val="Caption"/>
       </w:pPr>
       <w:r>
-        <w:rPr>
-          <w:i/>
-          <w:sz w:val="18"/>
-        </w:rPr>
-        <w:t>*Table 1b: MAG-IMG002X1-NC Electro-Optical Test Parameters (T0038)*</w:t>
+        <w:t xml:space="preserve">Table </w:t>
+      </w:r>
+      <w:r>
+        <w:fldChar w:fldCharType="begin"/>
+      </w:r>
+      <w:r>
+        <w:instrText xml:space="preserve"> SEQ Table \* ARABIC </w:instrText>
+      </w:r>
+      <w:r>
+        <w:fldChar w:fldCharType="separate"/>
+      </w:r>
+      <w:r>
+        <w:t>#</w:t>
+      </w:r>
+      <w:r>
+        <w:fldChar w:fldCharType="end"/>
+      </w:r>
+      <w:r>
+        <w:t>: MAG-IMG002X1-NC Electro-Optical Test Parameters (T0038)</w:t>
       </w:r>
     </w:p>
     <w:tbl>
@@ -19517,19 +21181,33 @@
         <w:pStyle w:val="Heading2"/>
       </w:pPr>
       <w:r>
-        <w:t>7.2 MAG-CXP00002-NP (CoaXPress Serializer ASIC)</w:t>
+        <w:t>MAG-CXP00002-NP (CoaXPress Serializer ASIC)</w:t>
       </w:r>
     </w:p>
     <w:p>
       <w:pPr>
-        <w:jc w:val="center"/>
+        <w:pStyle w:val="Caption"/>
       </w:pPr>
       <w:r>
-        <w:rPr>
-          <w:i/>
-          <w:sz w:val="18"/>
-        </w:rPr>
-        <w:t>*Table 2: MAG-CXP00002-NP Key Specifications*</w:t>
+        <w:t xml:space="preserve">Table </w:t>
+      </w:r>
+      <w:r>
+        <w:fldChar w:fldCharType="begin"/>
+      </w:r>
+      <w:r>
+        <w:instrText xml:space="preserve"> SEQ Table \* ARABIC </w:instrText>
+      </w:r>
+      <w:r>
+        <w:fldChar w:fldCharType="separate"/>
+      </w:r>
+      <w:r>
+        <w:t>#</w:t>
+      </w:r>
+      <w:r>
+        <w:fldChar w:fldCharType="end"/>
+      </w:r>
+      <w:r>
+        <w:t>: MAG-CXP00002-NP Key Specifications</w:t>
       </w:r>
     </w:p>
     <w:tbl>
@@ -21763,19 +23441,33 @@
         <w:pStyle w:val="Heading2"/>
       </w:pPr>
       <w:r>
-        <w:t>7.3 MAG-PSU00001-NP (10W Synchronous Step-Down DC/DC Converter)</w:t>
+        <w:t>MAG-PSU00001-NP (10W Synchronous Step-Down DC/DC Converter)</w:t>
       </w:r>
     </w:p>
     <w:p>
       <w:pPr>
-        <w:jc w:val="center"/>
+        <w:pStyle w:val="Caption"/>
       </w:pPr>
       <w:r>
-        <w:rPr>
-          <w:i/>
-          <w:sz w:val="18"/>
-        </w:rPr>
-        <w:t>*Table 3: MAG-PSU00001-NP Key Specifications*</w:t>
+        <w:t xml:space="preserve">Table </w:t>
+      </w:r>
+      <w:r>
+        <w:fldChar w:fldCharType="begin"/>
+      </w:r>
+      <w:r>
+        <w:instrText xml:space="preserve"> SEQ Table \* ARABIC </w:instrText>
+      </w:r>
+      <w:r>
+        <w:fldChar w:fldCharType="separate"/>
+      </w:r>
+      <w:r>
+        <w:t>#</w:t>
+      </w:r>
+      <w:r>
+        <w:fldChar w:fldCharType="end"/>
+      </w:r>
+      <w:r>
+        <w:t>: MAG-PSU00001-NP Key Specifications</w:t>
       </w:r>
     </w:p>
     <w:tbl>
@@ -24817,19 +26509,33 @@
         <w:pStyle w:val="Heading2"/>
       </w:pPr>
       <w:r>
-        <w:t>7.4 MAG-VIS100xx-N (Electronic Vision Module)</w:t>
+        <w:t>MAG-VIS100xx-N (Electronic Vision Module)</w:t>
       </w:r>
     </w:p>
     <w:p>
       <w:pPr>
-        <w:jc w:val="center"/>
+        <w:pStyle w:val="Caption"/>
       </w:pPr>
       <w:r>
-        <w:rPr>
-          <w:i/>
-          <w:sz w:val="18"/>
-        </w:rPr>
-        <w:t>*Table 4: MAG-VIS100xx-N Key Specifications*</w:t>
+        <w:t xml:space="preserve">Table </w:t>
+      </w:r>
+      <w:r>
+        <w:fldChar w:fldCharType="begin"/>
+      </w:r>
+      <w:r>
+        <w:instrText xml:space="preserve"> SEQ Table \* ARABIC </w:instrText>
+      </w:r>
+      <w:r>
+        <w:fldChar w:fldCharType="separate"/>
+      </w:r>
+      <w:r>
+        <w:t>#</w:t>
+      </w:r>
+      <w:r>
+        <w:fldChar w:fldCharType="end"/>
+      </w:r>
+      <w:r>
+        <w:t>: MAG-VIS100xx-N Key Specifications</w:t>
       </w:r>
     </w:p>
     <w:tbl>
@@ -25178,6 +26884,208 @@
                 <w:sz w:val="20"/>
               </w:rPr>
               <w:t>-</w:t>
+            </w:r>
+          </w:p>
+        </w:tc>
+      </w:tr>
+    </w:tbl>
+    <w:p/>
+    <w:p/>
+    <w:p>
+      <w:pPr>
+        <w:pStyle w:val="Heading1"/>
+      </w:pPr>
+      <w:r>
+        <w:t>References</w:t>
+      </w:r>
+    </w:p>
+    <w:p>
+      <w:pPr>
+        <w:pStyle w:val="Caption"/>
+      </w:pPr>
+      <w:r>
+        <w:t xml:space="preserve">Table </w:t>
+      </w:r>
+      <w:r>
+        <w:fldChar w:fldCharType="begin"/>
+      </w:r>
+      <w:r>
+        <w:instrText xml:space="preserve"> SEQ Table \* ARABIC </w:instrText>
+      </w:r>
+      <w:r>
+        <w:fldChar w:fldCharType="separate"/>
+      </w:r>
+      <w:r>
+        <w:t>#</w:t>
+      </w:r>
+      <w:r>
+        <w:fldChar w:fldCharType="end"/>
+      </w:r>
+      <w:r>
+        <w:t>: Reference Documents</w:t>
+      </w:r>
+    </w:p>
+    <w:tbl>
+      <w:tblPr>
+        <w:tblStyle w:val="GridTable4-Accent3"/>
+        <w:tblW w:type="auto" w:w="0"/>
+        <w:jc w:val="center"/>
+        <w:tblLook w:firstColumn="1" w:firstRow="1" w:lastColumn="0" w:lastRow="0" w:noHBand="0" w:noVBand="1" w:val="04A0"/>
+      </w:tblPr>
+      <w:tblGrid>
+        <w:gridCol w:w="4819"/>
+        <w:gridCol w:w="4819"/>
+      </w:tblGrid>
+      <w:tr>
+        <w:tc>
+          <w:tcPr>
+            <w:tcW w:type="dxa" w:w="4819"/>
+          </w:tcPr>
+          <w:p>
+            <w:r/>
+            <w:r>
+              <w:rPr>
+                <w:rFonts w:ascii="Calibri" w:hAnsi="Calibri"/>
+                <w:b/>
+                <w:sz w:val="20"/>
+              </w:rPr>
+              <w:t>Document Name</w:t>
+            </w:r>
+          </w:p>
+        </w:tc>
+        <w:tc>
+          <w:tcPr>
+            <w:tcW w:type="dxa" w:w="4819"/>
+          </w:tcPr>
+          <w:p>
+            <w:r/>
+            <w:r>
+              <w:rPr>
+                <w:rFonts w:ascii="Calibri" w:hAnsi="Calibri"/>
+                <w:b/>
+                <w:sz w:val="20"/>
+              </w:rPr>
+              <w:t>Version</w:t>
+            </w:r>
+          </w:p>
+        </w:tc>
+      </w:tr>
+      <w:tr>
+        <w:tc>
+          <w:tcPr>
+            <w:tcW w:type="dxa" w:w="4819"/>
+          </w:tcPr>
+          <w:p>
+            <w:r>
+              <w:rPr>
+                <w:rFonts w:ascii="Calibri" w:hAnsi="Calibri"/>
+                <w:sz w:val="20"/>
+              </w:rPr>
+              <w:t>MAG-IMG002X1-NC Datasheet</w:t>
+            </w:r>
+          </w:p>
+        </w:tc>
+        <w:tc>
+          <w:tcPr>
+            <w:tcW w:type="dxa" w:w="4819"/>
+          </w:tcPr>
+          <w:p>
+            <w:r>
+              <w:rPr>
+                <w:rFonts w:ascii="Calibri" w:hAnsi="Calibri"/>
+                <w:sz w:val="20"/>
+              </w:rPr>
+              <w:t>Rev. 1.2 (December 2025)</w:t>
+            </w:r>
+          </w:p>
+        </w:tc>
+      </w:tr>
+      <w:tr>
+        <w:tc>
+          <w:tcPr>
+            <w:tcW w:type="dxa" w:w="4819"/>
+          </w:tcPr>
+          <w:p>
+            <w:r>
+              <w:rPr>
+                <w:rFonts w:ascii="Calibri" w:hAnsi="Calibri"/>
+                <w:sz w:val="20"/>
+              </w:rPr>
+              <w:t>MAG-CXP00002-NP Datasheet</w:t>
+            </w:r>
+          </w:p>
+        </w:tc>
+        <w:tc>
+          <w:tcPr>
+            <w:tcW w:type="dxa" w:w="4819"/>
+          </w:tcPr>
+          <w:p>
+            <w:r>
+              <w:rPr>
+                <w:rFonts w:ascii="Calibri" w:hAnsi="Calibri"/>
+                <w:sz w:val="20"/>
+              </w:rPr>
+              <w:t>Rev. 2.1 (November 2025)</w:t>
+            </w:r>
+          </w:p>
+        </w:tc>
+      </w:tr>
+      <w:tr>
+        <w:tc>
+          <w:tcPr>
+            <w:tcW w:type="dxa" w:w="4819"/>
+          </w:tcPr>
+          <w:p>
+            <w:r>
+              <w:rPr>
+                <w:rFonts w:ascii="Calibri" w:hAnsi="Calibri"/>
+                <w:sz w:val="20"/>
+              </w:rPr>
+              <w:t>MAG-PSU00001-NP Datasheet</w:t>
+            </w:r>
+          </w:p>
+        </w:tc>
+        <w:tc>
+          <w:tcPr>
+            <w:tcW w:type="dxa" w:w="4819"/>
+          </w:tcPr>
+          <w:p>
+            <w:r>
+              <w:rPr>
+                <w:rFonts w:ascii="Calibri" w:hAnsi="Calibri"/>
+                <w:sz w:val="20"/>
+              </w:rPr>
+              <w:t>Rev. 0.5 (May 2025)</w:t>
+            </w:r>
+          </w:p>
+        </w:tc>
+      </w:tr>
+      <w:tr>
+        <w:tc>
+          <w:tcPr>
+            <w:tcW w:type="dxa" w:w="4819"/>
+          </w:tcPr>
+          <w:p>
+            <w:r>
+              <w:rPr>
+                <w:rFonts w:ascii="Calibri" w:hAnsi="Calibri"/>
+                <w:sz w:val="20"/>
+              </w:rPr>
+              <w:t>MAG-VIS100xx-N Datasheet</w:t>
+            </w:r>
+          </w:p>
+        </w:tc>
+        <w:tc>
+          <w:tcPr>
+            <w:tcW w:type="dxa" w:w="4819"/>
+          </w:tcPr>
+          <w:p>
+            <w:r>
+              <w:rPr>
+                <w:rFonts w:ascii="Calibri" w:hAnsi="Calibri"/>
+                <w:sz w:val="20"/>
+              </w:rPr>
+              <w:t>Rev. 1.1 (November 2025)</w:t>
             </w:r>
           </w:p>
         </w:tc>

</xml_diff>